<commit_message>
Ron 16: sinkronkan gambar distribusi (Gambar 4.1-4.7 & 5.1) dengan tabel
Gambar tertanam di docx masih render lama sehingga tidak cocok dengan tabel
yang sudah terverifikasi CSV. Chart dibuat ulang read-only dari data yang sama
dengan tabel (dataset_train.csv, indobert_absa_result_oof.csv,
distribusi_aspek_sentimen.csv), lalu media tertanam diganti via python-docx
(blip r:embed + drop rel; image1/2/6 tidak disentuh termasuk Gambar 4.4 yang
sudah benar). Gaya bar chart meniru script pipeline sehingga ukuran tampil
(extent) dan paginasi (94 halaman, 24.735 kata) tidak berubah.

Temuan sampingan: salinan kerja docx sempat di-save ulang oleh Word pengguna
sehingga EE0000 hilang dan run membengkak (4878 -> 8635). Docx di-restore dari
HEAD (94f516d), embed diulang, lalu refresh field via update_fields.ps1.
finalcheck = 0 gagal (italic 1.014, EE0000 1); 7 gambar baru byte-identik dengan
chart sumber terverifikasi.
</commit_message>
<xml_diff>
--- a/Laporan_skripsi/Mulai Revisi RCA BARU_Tiktok_Skripsi_Rayhan_Farras_Ramadhan_225150707111007_REVISI.docx
+++ b/Laporan_skripsi/Mulai Revisi RCA BARU_Tiktok_Skripsi_Rayhan_Farras_Ramadhan_225150707111007_REVISI.docx
@@ -332,7 +332,7 @@
       <w:pPr>
         <w:pStyle w:val="DefaultHeading"/>
       </w:pPr>
-      <w:bookmarkStart w:id="0" w:name="_Toc242387689"/>
+      <w:bookmarkStart w:id="0" w:name="_Toc242394305"/>
       <w:r>
         <w:lastRenderedPageBreak/>
         <w:t>ABSTRAK</w:t>
@@ -365,7 +365,7 @@
       <w:pPr>
         <w:pStyle w:val="DefaultHeading"/>
       </w:pPr>
-      <w:bookmarkStart w:id="1" w:name="_Toc242387690"/>
+      <w:bookmarkStart w:id="1" w:name="_Toc242394306"/>
       <w:r>
         <w:lastRenderedPageBreak/>
         <w:t>DAFTAR ISI</w:t>
@@ -446,7 +446,7 @@
             </w:rPr>
             <w:fldChar w:fldCharType="separate"/>
           </w:r>
-          <w:hyperlink w:anchor="_Toc242387689" w:history="1">
+          <w:hyperlink w:anchor="_Toc242394305" w:history="1">
             <w:r>
               <w:rPr>
                 <w:rStyle w:val="Hyperlink"/>
@@ -473,7 +473,7 @@
                 <w:noProof/>
                 <w:webHidden/>
               </w:rPr>
-              <w:instrText xml:space="preserve"> PAGEREF _Toc242387689 \h </w:instrText>
+              <w:instrText xml:space="preserve"> PAGEREF _Toc242394305 \h </w:instrText>
             </w:r>
             <w:r>
               <w:rPr>
@@ -519,7 +519,7 @@
               <w14:ligatures w14:val="standardContextual"/>
             </w:rPr>
           </w:pPr>
-          <w:hyperlink w:anchor="_Toc242387690" w:history="1">
+          <w:hyperlink w:anchor="_Toc242394306" w:history="1">
             <w:r>
               <w:rPr>
                 <w:rStyle w:val="Hyperlink"/>
@@ -546,7 +546,7 @@
                 <w:noProof/>
                 <w:webHidden/>
               </w:rPr>
-              <w:instrText xml:space="preserve"> PAGEREF _Toc242387690 \h </w:instrText>
+              <w:instrText xml:space="preserve"> PAGEREF _Toc242394306 \h </w:instrText>
             </w:r>
             <w:r>
               <w:rPr>
@@ -592,7 +592,7 @@
               <w14:ligatures w14:val="standardContextual"/>
             </w:rPr>
           </w:pPr>
-          <w:hyperlink w:anchor="_Toc242387691" w:history="1">
+          <w:hyperlink w:anchor="_Toc242394307" w:history="1">
             <w:r>
               <w:rPr>
                 <w:rStyle w:val="Hyperlink"/>
@@ -619,7 +619,7 @@
                 <w:noProof/>
                 <w:webHidden/>
               </w:rPr>
-              <w:instrText xml:space="preserve"> PAGEREF _Toc242387691 \h </w:instrText>
+              <w:instrText xml:space="preserve"> PAGEREF _Toc242394307 \h </w:instrText>
             </w:r>
             <w:r>
               <w:rPr>
@@ -665,7 +665,7 @@
               <w14:ligatures w14:val="standardContextual"/>
             </w:rPr>
           </w:pPr>
-          <w:hyperlink w:anchor="_Toc242387692" w:history="1">
+          <w:hyperlink w:anchor="_Toc242394308" w:history="1">
             <w:r>
               <w:rPr>
                 <w:rStyle w:val="Hyperlink"/>
@@ -692,7 +692,7 @@
                 <w:noProof/>
                 <w:webHidden/>
               </w:rPr>
-              <w:instrText xml:space="preserve"> PAGEREF _Toc242387692 \h </w:instrText>
+              <w:instrText xml:space="preserve"> PAGEREF _Toc242394308 \h </w:instrText>
             </w:r>
             <w:r>
               <w:rPr>
@@ -738,7 +738,7 @@
               <w14:ligatures w14:val="standardContextual"/>
             </w:rPr>
           </w:pPr>
-          <w:hyperlink w:anchor="_Toc242387693" w:history="1">
+          <w:hyperlink w:anchor="_Toc242394309" w:history="1">
             <w:r>
               <w:rPr>
                 <w:rStyle w:val="Hyperlink"/>
@@ -765,7 +765,7 @@
                 <w:noProof/>
                 <w:webHidden/>
               </w:rPr>
-              <w:instrText xml:space="preserve"> PAGEREF _Toc242387693 \h </w:instrText>
+              <w:instrText xml:space="preserve"> PAGEREF _Toc242394309 \h </w:instrText>
             </w:r>
             <w:r>
               <w:rPr>
@@ -814,7 +814,7 @@
               <w14:ligatures w14:val="standardContextual"/>
             </w:rPr>
           </w:pPr>
-          <w:hyperlink w:anchor="_Toc242387694" w:history="1">
+          <w:hyperlink w:anchor="_Toc242394310" w:history="1">
             <w:r>
               <w:rPr>
                 <w:rStyle w:val="Hyperlink"/>
@@ -841,7 +841,7 @@
                 <w:noProof/>
                 <w:webHidden/>
               </w:rPr>
-              <w:instrText xml:space="preserve"> PAGEREF _Toc242387694 \h </w:instrText>
+              <w:instrText xml:space="preserve"> PAGEREF _Toc242394310 \h </w:instrText>
             </w:r>
             <w:r>
               <w:rPr>
@@ -890,7 +890,7 @@
               <w14:ligatures w14:val="standardContextual"/>
             </w:rPr>
           </w:pPr>
-          <w:hyperlink w:anchor="_Toc242387695" w:history="1">
+          <w:hyperlink w:anchor="_Toc242394311" w:history="1">
             <w:r>
               <w:rPr>
                 <w:rStyle w:val="Hyperlink"/>
@@ -917,7 +917,7 @@
                 <w:noProof/>
                 <w:webHidden/>
               </w:rPr>
-              <w:instrText xml:space="preserve"> PAGEREF _Toc242387695 \h </w:instrText>
+              <w:instrText xml:space="preserve"> PAGEREF _Toc242394311 \h </w:instrText>
             </w:r>
             <w:r>
               <w:rPr>
@@ -966,7 +966,7 @@
               <w14:ligatures w14:val="standardContextual"/>
             </w:rPr>
           </w:pPr>
-          <w:hyperlink w:anchor="_Toc242387696" w:history="1">
+          <w:hyperlink w:anchor="_Toc242394312" w:history="1">
             <w:r>
               <w:rPr>
                 <w:rStyle w:val="Hyperlink"/>
@@ -993,7 +993,7 @@
                 <w:noProof/>
                 <w:webHidden/>
               </w:rPr>
-              <w:instrText xml:space="preserve"> PAGEREF _Toc242387696 \h </w:instrText>
+              <w:instrText xml:space="preserve"> PAGEREF _Toc242394312 \h </w:instrText>
             </w:r>
             <w:r>
               <w:rPr>
@@ -1042,7 +1042,7 @@
               <w14:ligatures w14:val="standardContextual"/>
             </w:rPr>
           </w:pPr>
-          <w:hyperlink w:anchor="_Toc242387697" w:history="1">
+          <w:hyperlink w:anchor="_Toc242394313" w:history="1">
             <w:r>
               <w:rPr>
                 <w:rStyle w:val="Hyperlink"/>
@@ -1069,7 +1069,7 @@
                 <w:noProof/>
                 <w:webHidden/>
               </w:rPr>
-              <w:instrText xml:space="preserve"> PAGEREF _Toc242387697 \h </w:instrText>
+              <w:instrText xml:space="preserve"> PAGEREF _Toc242394313 \h </w:instrText>
             </w:r>
             <w:r>
               <w:rPr>
@@ -1118,7 +1118,7 @@
               <w14:ligatures w14:val="standardContextual"/>
             </w:rPr>
           </w:pPr>
-          <w:hyperlink w:anchor="_Toc242387698" w:history="1">
+          <w:hyperlink w:anchor="_Toc242394314" w:history="1">
             <w:r>
               <w:rPr>
                 <w:rStyle w:val="Hyperlink"/>
@@ -1145,7 +1145,7 @@
                 <w:noProof/>
                 <w:webHidden/>
               </w:rPr>
-              <w:instrText xml:space="preserve"> PAGEREF _Toc242387698 \h </w:instrText>
+              <w:instrText xml:space="preserve"> PAGEREF _Toc242394314 \h </w:instrText>
             </w:r>
             <w:r>
               <w:rPr>
@@ -1194,7 +1194,7 @@
               <w14:ligatures w14:val="standardContextual"/>
             </w:rPr>
           </w:pPr>
-          <w:hyperlink w:anchor="_Toc242387699" w:history="1">
+          <w:hyperlink w:anchor="_Toc242394315" w:history="1">
             <w:r>
               <w:rPr>
                 <w:rStyle w:val="Hyperlink"/>
@@ -1221,7 +1221,7 @@
                 <w:noProof/>
                 <w:webHidden/>
               </w:rPr>
-              <w:instrText xml:space="preserve"> PAGEREF _Toc242387699 \h </w:instrText>
+              <w:instrText xml:space="preserve"> PAGEREF _Toc242394315 \h </w:instrText>
             </w:r>
             <w:r>
               <w:rPr>
@@ -1270,7 +1270,7 @@
               <w14:ligatures w14:val="standardContextual"/>
             </w:rPr>
           </w:pPr>
-          <w:hyperlink w:anchor="_Toc242387700" w:history="1">
+          <w:hyperlink w:anchor="_Toc242394316" w:history="1">
             <w:r>
               <w:rPr>
                 <w:rStyle w:val="Hyperlink"/>
@@ -1297,7 +1297,7 @@
                 <w:noProof/>
                 <w:webHidden/>
               </w:rPr>
-              <w:instrText xml:space="preserve"> PAGEREF _Toc242387700 \h </w:instrText>
+              <w:instrText xml:space="preserve"> PAGEREF _Toc242394316 \h </w:instrText>
             </w:r>
             <w:r>
               <w:rPr>
@@ -1343,7 +1343,7 @@
               <w14:ligatures w14:val="standardContextual"/>
             </w:rPr>
           </w:pPr>
-          <w:hyperlink w:anchor="_Toc242387701" w:history="1">
+          <w:hyperlink w:anchor="_Toc242394317" w:history="1">
             <w:r>
               <w:rPr>
                 <w:rStyle w:val="Hyperlink"/>
@@ -1370,7 +1370,7 @@
                 <w:noProof/>
                 <w:webHidden/>
               </w:rPr>
-              <w:instrText xml:space="preserve"> PAGEREF _Toc242387701 \h </w:instrText>
+              <w:instrText xml:space="preserve"> PAGEREF _Toc242394317 \h </w:instrText>
             </w:r>
             <w:r>
               <w:rPr>
@@ -1419,7 +1419,7 @@
               <w14:ligatures w14:val="standardContextual"/>
             </w:rPr>
           </w:pPr>
-          <w:hyperlink w:anchor="_Toc242387702" w:history="1">
+          <w:hyperlink w:anchor="_Toc242394318" w:history="1">
             <w:r>
               <w:rPr>
                 <w:rStyle w:val="Hyperlink"/>
@@ -1446,7 +1446,7 @@
                 <w:noProof/>
                 <w:webHidden/>
               </w:rPr>
-              <w:instrText xml:space="preserve"> PAGEREF _Toc242387702 \h </w:instrText>
+              <w:instrText xml:space="preserve"> PAGEREF _Toc242394318 \h </w:instrText>
             </w:r>
             <w:r>
               <w:rPr>
@@ -1495,7 +1495,7 @@
               <w14:ligatures w14:val="standardContextual"/>
             </w:rPr>
           </w:pPr>
-          <w:hyperlink w:anchor="_Toc242387703" w:history="1">
+          <w:hyperlink w:anchor="_Toc242394319" w:history="1">
             <w:r>
               <w:rPr>
                 <w:rStyle w:val="Hyperlink"/>
@@ -1522,7 +1522,7 @@
                 <w:noProof/>
                 <w:webHidden/>
               </w:rPr>
-              <w:instrText xml:space="preserve"> PAGEREF _Toc242387703 \h </w:instrText>
+              <w:instrText xml:space="preserve"> PAGEREF _Toc242394319 \h </w:instrText>
             </w:r>
             <w:r>
               <w:rPr>
@@ -1569,7 +1569,7 @@
               <w14:ligatures w14:val="standardContextual"/>
             </w:rPr>
           </w:pPr>
-          <w:hyperlink w:anchor="_Toc242387704" w:history="1">
+          <w:hyperlink w:anchor="_Toc242394320" w:history="1">
             <w:r>
               <w:rPr>
                 <w:rStyle w:val="Hyperlink"/>
@@ -1596,7 +1596,7 @@
                 <w:noProof/>
                 <w:webHidden/>
               </w:rPr>
-              <w:instrText xml:space="preserve"> PAGEREF _Toc242387704 \h </w:instrText>
+              <w:instrText xml:space="preserve"> PAGEREF _Toc242394320 \h </w:instrText>
             </w:r>
             <w:r>
               <w:rPr>
@@ -1643,7 +1643,7 @@
               <w14:ligatures w14:val="standardContextual"/>
             </w:rPr>
           </w:pPr>
-          <w:hyperlink w:anchor="_Toc242387705" w:history="1">
+          <w:hyperlink w:anchor="_Toc242394321" w:history="1">
             <w:r>
               <w:rPr>
                 <w:rStyle w:val="Hyperlink"/>
@@ -1670,7 +1670,7 @@
                 <w:noProof/>
                 <w:webHidden/>
               </w:rPr>
-              <w:instrText xml:space="preserve"> PAGEREF _Toc242387705 \h </w:instrText>
+              <w:instrText xml:space="preserve"> PAGEREF _Toc242394321 \h </w:instrText>
             </w:r>
             <w:r>
               <w:rPr>
@@ -1717,7 +1717,7 @@
               <w14:ligatures w14:val="standardContextual"/>
             </w:rPr>
           </w:pPr>
-          <w:hyperlink w:anchor="_Toc242387706" w:history="1">
+          <w:hyperlink w:anchor="_Toc242394322" w:history="1">
             <w:r>
               <w:rPr>
                 <w:rStyle w:val="Hyperlink"/>
@@ -1744,7 +1744,7 @@
                 <w:noProof/>
                 <w:webHidden/>
               </w:rPr>
-              <w:instrText xml:space="preserve"> PAGEREF _Toc242387706 \h </w:instrText>
+              <w:instrText xml:space="preserve"> PAGEREF _Toc242394322 \h </w:instrText>
             </w:r>
             <w:r>
               <w:rPr>
@@ -1793,7 +1793,7 @@
               <w14:ligatures w14:val="standardContextual"/>
             </w:rPr>
           </w:pPr>
-          <w:hyperlink w:anchor="_Toc242387707" w:history="1">
+          <w:hyperlink w:anchor="_Toc242394323" w:history="1">
             <w:r>
               <w:rPr>
                 <w:rStyle w:val="Hyperlink"/>
@@ -1835,7 +1835,7 @@
                 <w:noProof/>
                 <w:webHidden/>
               </w:rPr>
-              <w:instrText xml:space="preserve"> PAGEREF _Toc242387707 \h </w:instrText>
+              <w:instrText xml:space="preserve"> PAGEREF _Toc242394323 \h </w:instrText>
             </w:r>
             <w:r>
               <w:rPr>
@@ -1882,7 +1882,7 @@
               <w14:ligatures w14:val="standardContextual"/>
             </w:rPr>
           </w:pPr>
-          <w:hyperlink w:anchor="_Toc242387708" w:history="1">
+          <w:hyperlink w:anchor="_Toc242394324" w:history="1">
             <w:r>
               <w:rPr>
                 <w:rStyle w:val="Hyperlink"/>
@@ -1917,7 +1917,7 @@
                 <w:noProof/>
                 <w:webHidden/>
               </w:rPr>
-              <w:instrText xml:space="preserve"> PAGEREF _Toc242387708 \h </w:instrText>
+              <w:instrText xml:space="preserve"> PAGEREF _Toc242394324 \h </w:instrText>
             </w:r>
             <w:r>
               <w:rPr>
@@ -1964,7 +1964,7 @@
               <w14:ligatures w14:val="standardContextual"/>
             </w:rPr>
           </w:pPr>
-          <w:hyperlink w:anchor="_Toc242387709" w:history="1">
+          <w:hyperlink w:anchor="_Toc242394325" w:history="1">
             <w:r>
               <w:rPr>
                 <w:rStyle w:val="Hyperlink"/>
@@ -1991,7 +1991,7 @@
                 <w:noProof/>
                 <w:webHidden/>
               </w:rPr>
-              <w:instrText xml:space="preserve"> PAGEREF _Toc242387709 \h </w:instrText>
+              <w:instrText xml:space="preserve"> PAGEREF _Toc242394325 \h </w:instrText>
             </w:r>
             <w:r>
               <w:rPr>
@@ -2038,7 +2038,7 @@
               <w14:ligatures w14:val="standardContextual"/>
             </w:rPr>
           </w:pPr>
-          <w:hyperlink w:anchor="_Toc242387710" w:history="1">
+          <w:hyperlink w:anchor="_Toc242394326" w:history="1">
             <w:r>
               <w:rPr>
                 <w:rStyle w:val="Hyperlink"/>
@@ -2081,7 +2081,7 @@
                 <w:noProof/>
                 <w:webHidden/>
               </w:rPr>
-              <w:instrText xml:space="preserve"> PAGEREF _Toc242387710 \h </w:instrText>
+              <w:instrText xml:space="preserve"> PAGEREF _Toc242394326 \h </w:instrText>
             </w:r>
             <w:r>
               <w:rPr>
@@ -2130,7 +2130,7 @@
               <w14:ligatures w14:val="standardContextual"/>
             </w:rPr>
           </w:pPr>
-          <w:hyperlink w:anchor="_Toc242387711" w:history="1">
+          <w:hyperlink w:anchor="_Toc242394327" w:history="1">
             <w:r>
               <w:rPr>
                 <w:rStyle w:val="Hyperlink"/>
@@ -2166,7 +2166,7 @@
                 <w:noProof/>
                 <w:webHidden/>
               </w:rPr>
-              <w:instrText xml:space="preserve"> PAGEREF _Toc242387711 \h </w:instrText>
+              <w:instrText xml:space="preserve"> PAGEREF _Toc242394327 \h </w:instrText>
             </w:r>
             <w:r>
               <w:rPr>
@@ -2213,7 +2213,7 @@
               <w14:ligatures w14:val="standardContextual"/>
             </w:rPr>
           </w:pPr>
-          <w:hyperlink w:anchor="_Toc242387712" w:history="1">
+          <w:hyperlink w:anchor="_Toc242394328" w:history="1">
             <w:r>
               <w:rPr>
                 <w:rStyle w:val="Hyperlink"/>
@@ -2240,7 +2240,7 @@
                 <w:noProof/>
                 <w:webHidden/>
               </w:rPr>
-              <w:instrText xml:space="preserve"> PAGEREF _Toc242387712 \h </w:instrText>
+              <w:instrText xml:space="preserve"> PAGEREF _Toc242394328 \h </w:instrText>
             </w:r>
             <w:r>
               <w:rPr>
@@ -2287,7 +2287,7 @@
               <w14:ligatures w14:val="standardContextual"/>
             </w:rPr>
           </w:pPr>
-          <w:hyperlink w:anchor="_Toc242387713" w:history="1">
+          <w:hyperlink w:anchor="_Toc242394329" w:history="1">
             <w:r>
               <w:rPr>
                 <w:rStyle w:val="Hyperlink"/>
@@ -2329,7 +2329,7 @@
                 <w:noProof/>
                 <w:webHidden/>
               </w:rPr>
-              <w:instrText xml:space="preserve"> PAGEREF _Toc242387713 \h </w:instrText>
+              <w:instrText xml:space="preserve"> PAGEREF _Toc242394329 \h </w:instrText>
             </w:r>
             <w:r>
               <w:rPr>
@@ -2376,7 +2376,7 @@
               <w14:ligatures w14:val="standardContextual"/>
             </w:rPr>
           </w:pPr>
-          <w:hyperlink w:anchor="_Toc242387714" w:history="1">
+          <w:hyperlink w:anchor="_Toc242394330" w:history="1">
             <w:r>
               <w:rPr>
                 <w:rStyle w:val="Hyperlink"/>
@@ -2412,7 +2412,7 @@
                 <w:noProof/>
                 <w:webHidden/>
               </w:rPr>
-              <w:instrText xml:space="preserve"> PAGEREF _Toc242387714 \h </w:instrText>
+              <w:instrText xml:space="preserve"> PAGEREF _Toc242394330 \h </w:instrText>
             </w:r>
             <w:r>
               <w:rPr>
@@ -2461,7 +2461,7 @@
               <w14:ligatures w14:val="standardContextual"/>
             </w:rPr>
           </w:pPr>
-          <w:hyperlink w:anchor="_Toc242387715" w:history="1">
+          <w:hyperlink w:anchor="_Toc242394331" w:history="1">
             <w:r>
               <w:rPr>
                 <w:rStyle w:val="Hyperlink"/>
@@ -2506,7 +2506,7 @@
                 <w:noProof/>
                 <w:webHidden/>
               </w:rPr>
-              <w:instrText xml:space="preserve"> PAGEREF _Toc242387715 \h </w:instrText>
+              <w:instrText xml:space="preserve"> PAGEREF _Toc242394331 \h </w:instrText>
             </w:r>
             <w:r>
               <w:rPr>
@@ -2553,7 +2553,7 @@
               <w14:ligatures w14:val="standardContextual"/>
             </w:rPr>
           </w:pPr>
-          <w:hyperlink w:anchor="_Toc242387716" w:history="1">
+          <w:hyperlink w:anchor="_Toc242394332" w:history="1">
             <w:r>
               <w:rPr>
                 <w:rStyle w:val="Hyperlink"/>
@@ -2590,7 +2590,7 @@
                 <w:noProof/>
                 <w:webHidden/>
               </w:rPr>
-              <w:instrText xml:space="preserve"> PAGEREF _Toc242387716 \h </w:instrText>
+              <w:instrText xml:space="preserve"> PAGEREF _Toc242394332 \h </w:instrText>
             </w:r>
             <w:r>
               <w:rPr>
@@ -2637,7 +2637,7 @@
               <w14:ligatures w14:val="standardContextual"/>
             </w:rPr>
           </w:pPr>
-          <w:hyperlink w:anchor="_Toc242387717" w:history="1">
+          <w:hyperlink w:anchor="_Toc242394333" w:history="1">
             <w:r>
               <w:rPr>
                 <w:rStyle w:val="Hyperlink"/>
@@ -2674,7 +2674,7 @@
                 <w:noProof/>
                 <w:webHidden/>
               </w:rPr>
-              <w:instrText xml:space="preserve"> PAGEREF _Toc242387717 \h </w:instrText>
+              <w:instrText xml:space="preserve"> PAGEREF _Toc242394333 \h </w:instrText>
             </w:r>
             <w:r>
               <w:rPr>
@@ -2721,7 +2721,7 @@
               <w14:ligatures w14:val="standardContextual"/>
             </w:rPr>
           </w:pPr>
-          <w:hyperlink w:anchor="_Toc242387718" w:history="1">
+          <w:hyperlink w:anchor="_Toc242394334" w:history="1">
             <w:r>
               <w:rPr>
                 <w:rStyle w:val="Hyperlink"/>
@@ -2749,7 +2749,7 @@
                 <w:noProof/>
                 <w:webHidden/>
               </w:rPr>
-              <w:instrText xml:space="preserve"> PAGEREF _Toc242387718 \h </w:instrText>
+              <w:instrText xml:space="preserve"> PAGEREF _Toc242394334 \h </w:instrText>
             </w:r>
             <w:r>
               <w:rPr>
@@ -2798,7 +2798,7 @@
               <w14:ligatures w14:val="standardContextual"/>
             </w:rPr>
           </w:pPr>
-          <w:hyperlink w:anchor="_Toc242387719" w:history="1">
+          <w:hyperlink w:anchor="_Toc242394335" w:history="1">
             <w:r>
               <w:rPr>
                 <w:rStyle w:val="Hyperlink"/>
@@ -2835,7 +2835,7 @@
                 <w:noProof/>
                 <w:webHidden/>
               </w:rPr>
-              <w:instrText xml:space="preserve"> PAGEREF _Toc242387719 \h </w:instrText>
+              <w:instrText xml:space="preserve"> PAGEREF _Toc242394335 \h </w:instrText>
             </w:r>
             <w:r>
               <w:rPr>
@@ -2884,7 +2884,7 @@
               <w14:ligatures w14:val="standardContextual"/>
             </w:rPr>
           </w:pPr>
-          <w:hyperlink w:anchor="_Toc242387720" w:history="1">
+          <w:hyperlink w:anchor="_Toc242394336" w:history="1">
             <w:r>
               <w:rPr>
                 <w:rStyle w:val="Hyperlink"/>
@@ -2929,7 +2929,7 @@
                 <w:noProof/>
                 <w:webHidden/>
               </w:rPr>
-              <w:instrText xml:space="preserve"> PAGEREF _Toc242387720 \h </w:instrText>
+              <w:instrText xml:space="preserve"> PAGEREF _Toc242394336 \h </w:instrText>
             </w:r>
             <w:r>
               <w:rPr>
@@ -2978,7 +2978,7 @@
               <w14:ligatures w14:val="standardContextual"/>
             </w:rPr>
           </w:pPr>
-          <w:hyperlink w:anchor="_Toc242387721" w:history="1">
+          <w:hyperlink w:anchor="_Toc242394337" w:history="1">
             <w:r>
               <w:rPr>
                 <w:rStyle w:val="Hyperlink"/>
@@ -3005,7 +3005,7 @@
                 <w:noProof/>
                 <w:webHidden/>
               </w:rPr>
-              <w:instrText xml:space="preserve"> PAGEREF _Toc242387721 \h </w:instrText>
+              <w:instrText xml:space="preserve"> PAGEREF _Toc242394337 \h </w:instrText>
             </w:r>
             <w:r>
               <w:rPr>
@@ -3051,7 +3051,7 @@
               <w14:ligatures w14:val="standardContextual"/>
             </w:rPr>
           </w:pPr>
-          <w:hyperlink w:anchor="_Toc242387722" w:history="1">
+          <w:hyperlink w:anchor="_Toc242394338" w:history="1">
             <w:r>
               <w:rPr>
                 <w:rStyle w:val="Hyperlink"/>
@@ -3078,7 +3078,7 @@
                 <w:noProof/>
                 <w:webHidden/>
               </w:rPr>
-              <w:instrText xml:space="preserve"> PAGEREF _Toc242387722 \h </w:instrText>
+              <w:instrText xml:space="preserve"> PAGEREF _Toc242394338 \h </w:instrText>
             </w:r>
             <w:r>
               <w:rPr>
@@ -3127,7 +3127,7 @@
               <w14:ligatures w14:val="standardContextual"/>
             </w:rPr>
           </w:pPr>
-          <w:hyperlink w:anchor="_Toc242387723" w:history="1">
+          <w:hyperlink w:anchor="_Toc242394339" w:history="1">
             <w:r>
               <w:rPr>
                 <w:rStyle w:val="Hyperlink"/>
@@ -3154,7 +3154,7 @@
                 <w:noProof/>
                 <w:webHidden/>
               </w:rPr>
-              <w:instrText xml:space="preserve"> PAGEREF _Toc242387723 \h </w:instrText>
+              <w:instrText xml:space="preserve"> PAGEREF _Toc242394339 \h </w:instrText>
             </w:r>
             <w:r>
               <w:rPr>
@@ -3203,7 +3203,7 @@
               <w14:ligatures w14:val="standardContextual"/>
             </w:rPr>
           </w:pPr>
-          <w:hyperlink w:anchor="_Toc242387724" w:history="1">
+          <w:hyperlink w:anchor="_Toc242394340" w:history="1">
             <w:r>
               <w:rPr>
                 <w:rStyle w:val="Hyperlink"/>
@@ -3230,7 +3230,7 @@
                 <w:noProof/>
                 <w:webHidden/>
               </w:rPr>
-              <w:instrText xml:space="preserve"> PAGEREF _Toc242387724 \h </w:instrText>
+              <w:instrText xml:space="preserve"> PAGEREF _Toc242394340 \h </w:instrText>
             </w:r>
             <w:r>
               <w:rPr>
@@ -3277,7 +3277,7 @@
               <w14:ligatures w14:val="standardContextual"/>
             </w:rPr>
           </w:pPr>
-          <w:hyperlink w:anchor="_Toc242387725" w:history="1">
+          <w:hyperlink w:anchor="_Toc242394341" w:history="1">
             <w:r>
               <w:rPr>
                 <w:rStyle w:val="Hyperlink"/>
@@ -3304,7 +3304,7 @@
                 <w:noProof/>
                 <w:webHidden/>
               </w:rPr>
-              <w:instrText xml:space="preserve"> PAGEREF _Toc242387725 \h </w:instrText>
+              <w:instrText xml:space="preserve"> PAGEREF _Toc242394341 \h </w:instrText>
             </w:r>
             <w:r>
               <w:rPr>
@@ -3351,7 +3351,7 @@
               <w14:ligatures w14:val="standardContextual"/>
             </w:rPr>
           </w:pPr>
-          <w:hyperlink w:anchor="_Toc242387726" w:history="1">
+          <w:hyperlink w:anchor="_Toc242394342" w:history="1">
             <w:r>
               <w:rPr>
                 <w:rStyle w:val="Hyperlink"/>
@@ -3378,7 +3378,7 @@
                 <w:noProof/>
                 <w:webHidden/>
               </w:rPr>
-              <w:instrText xml:space="preserve"> PAGEREF _Toc242387726 \h </w:instrText>
+              <w:instrText xml:space="preserve"> PAGEREF _Toc242394342 \h </w:instrText>
             </w:r>
             <w:r>
               <w:rPr>
@@ -3427,7 +3427,7 @@
               <w14:ligatures w14:val="standardContextual"/>
             </w:rPr>
           </w:pPr>
-          <w:hyperlink w:anchor="_Toc242387727" w:history="1">
+          <w:hyperlink w:anchor="_Toc242394343" w:history="1">
             <w:r>
               <w:rPr>
                 <w:rStyle w:val="Hyperlink"/>
@@ -3454,7 +3454,7 @@
                 <w:noProof/>
                 <w:webHidden/>
               </w:rPr>
-              <w:instrText xml:space="preserve"> PAGEREF _Toc242387727 \h </w:instrText>
+              <w:instrText xml:space="preserve"> PAGEREF _Toc242394343 \h </w:instrText>
             </w:r>
             <w:r>
               <w:rPr>
@@ -3501,7 +3501,7 @@
               <w14:ligatures w14:val="standardContextual"/>
             </w:rPr>
           </w:pPr>
-          <w:hyperlink w:anchor="_Toc242387728" w:history="1">
+          <w:hyperlink w:anchor="_Toc242394344" w:history="1">
             <w:r>
               <w:rPr>
                 <w:rStyle w:val="Hyperlink"/>
@@ -3536,7 +3536,7 @@
                 <w:noProof/>
                 <w:webHidden/>
               </w:rPr>
-              <w:instrText xml:space="preserve"> PAGEREF _Toc242387728 \h </w:instrText>
+              <w:instrText xml:space="preserve"> PAGEREF _Toc242394344 \h </w:instrText>
             </w:r>
             <w:r>
               <w:rPr>
@@ -3583,7 +3583,7 @@
               <w14:ligatures w14:val="standardContextual"/>
             </w:rPr>
           </w:pPr>
-          <w:hyperlink w:anchor="_Toc242387729" w:history="1">
+          <w:hyperlink w:anchor="_Toc242394345" w:history="1">
             <w:r>
               <w:rPr>
                 <w:rStyle w:val="Hyperlink"/>
@@ -3610,7 +3610,7 @@
                 <w:noProof/>
                 <w:webHidden/>
               </w:rPr>
-              <w:instrText xml:space="preserve"> PAGEREF _Toc242387729 \h </w:instrText>
+              <w:instrText xml:space="preserve"> PAGEREF _Toc242394345 \h </w:instrText>
             </w:r>
             <w:r>
               <w:rPr>
@@ -3657,7 +3657,7 @@
               <w14:ligatures w14:val="standardContextual"/>
             </w:rPr>
           </w:pPr>
-          <w:hyperlink w:anchor="_Toc242387730" w:history="1">
+          <w:hyperlink w:anchor="_Toc242394346" w:history="1">
             <w:r>
               <w:rPr>
                 <w:rStyle w:val="Hyperlink"/>
@@ -3684,7 +3684,7 @@
                 <w:noProof/>
                 <w:webHidden/>
               </w:rPr>
-              <w:instrText xml:space="preserve"> PAGEREF _Toc242387730 \h </w:instrText>
+              <w:instrText xml:space="preserve"> PAGEREF _Toc242394346 \h </w:instrText>
             </w:r>
             <w:r>
               <w:rPr>
@@ -3733,7 +3733,7 @@
               <w14:ligatures w14:val="standardContextual"/>
             </w:rPr>
           </w:pPr>
-          <w:hyperlink w:anchor="_Toc242387731" w:history="1">
+          <w:hyperlink w:anchor="_Toc242394347" w:history="1">
             <w:r>
               <w:rPr>
                 <w:rStyle w:val="Hyperlink"/>
@@ -3760,7 +3760,7 @@
                 <w:noProof/>
                 <w:webHidden/>
               </w:rPr>
-              <w:instrText xml:space="preserve"> PAGEREF _Toc242387731 \h </w:instrText>
+              <w:instrText xml:space="preserve"> PAGEREF _Toc242394347 \h </w:instrText>
             </w:r>
             <w:r>
               <w:rPr>
@@ -3807,7 +3807,7 @@
               <w14:ligatures w14:val="standardContextual"/>
             </w:rPr>
           </w:pPr>
-          <w:hyperlink w:anchor="_Toc242387732" w:history="1">
+          <w:hyperlink w:anchor="_Toc242394348" w:history="1">
             <w:r>
               <w:rPr>
                 <w:rStyle w:val="Hyperlink"/>
@@ -3842,7 +3842,7 @@
                 <w:noProof/>
                 <w:webHidden/>
               </w:rPr>
-              <w:instrText xml:space="preserve"> PAGEREF _Toc242387732 \h </w:instrText>
+              <w:instrText xml:space="preserve"> PAGEREF _Toc242394348 \h </w:instrText>
             </w:r>
             <w:r>
               <w:rPr>
@@ -3889,7 +3889,7 @@
               <w14:ligatures w14:val="standardContextual"/>
             </w:rPr>
           </w:pPr>
-          <w:hyperlink w:anchor="_Toc242387733" w:history="1">
+          <w:hyperlink w:anchor="_Toc242394349" w:history="1">
             <w:r>
               <w:rPr>
                 <w:rStyle w:val="Hyperlink"/>
@@ -3924,7 +3924,7 @@
                 <w:noProof/>
                 <w:webHidden/>
               </w:rPr>
-              <w:instrText xml:space="preserve"> PAGEREF _Toc242387733 \h </w:instrText>
+              <w:instrText xml:space="preserve"> PAGEREF _Toc242394349 \h </w:instrText>
             </w:r>
             <w:r>
               <w:rPr>
@@ -3973,7 +3973,7 @@
               <w14:ligatures w14:val="standardContextual"/>
             </w:rPr>
           </w:pPr>
-          <w:hyperlink w:anchor="_Toc242387734" w:history="1">
+          <w:hyperlink w:anchor="_Toc242394350" w:history="1">
             <w:r>
               <w:rPr>
                 <w:rStyle w:val="Hyperlink"/>
@@ -4000,7 +4000,7 @@
                 <w:noProof/>
                 <w:webHidden/>
               </w:rPr>
-              <w:instrText xml:space="preserve"> PAGEREF _Toc242387734 \h </w:instrText>
+              <w:instrText xml:space="preserve"> PAGEREF _Toc242394350 \h </w:instrText>
             </w:r>
             <w:r>
               <w:rPr>
@@ -4047,7 +4047,7 @@
               <w14:ligatures w14:val="standardContextual"/>
             </w:rPr>
           </w:pPr>
-          <w:hyperlink w:anchor="_Toc242387735" w:history="1">
+          <w:hyperlink w:anchor="_Toc242394351" w:history="1">
             <w:r>
               <w:rPr>
                 <w:rStyle w:val="Hyperlink"/>
@@ -4090,7 +4090,7 @@
                 <w:noProof/>
                 <w:webHidden/>
               </w:rPr>
-              <w:instrText xml:space="preserve"> PAGEREF _Toc242387735 \h </w:instrText>
+              <w:instrText xml:space="preserve"> PAGEREF _Toc242394351 \h </w:instrText>
             </w:r>
             <w:r>
               <w:rPr>
@@ -4137,7 +4137,7 @@
               <w14:ligatures w14:val="standardContextual"/>
             </w:rPr>
           </w:pPr>
-          <w:hyperlink w:anchor="_Toc242387736" w:history="1">
+          <w:hyperlink w:anchor="_Toc242394352" w:history="1">
             <w:r>
               <w:rPr>
                 <w:rStyle w:val="Hyperlink"/>
@@ -4172,7 +4172,7 @@
                 <w:noProof/>
                 <w:webHidden/>
               </w:rPr>
-              <w:instrText xml:space="preserve"> PAGEREF _Toc242387736 \h </w:instrText>
+              <w:instrText xml:space="preserve"> PAGEREF _Toc242394352 \h </w:instrText>
             </w:r>
             <w:r>
               <w:rPr>
@@ -4219,7 +4219,7 @@
               <w14:ligatures w14:val="standardContextual"/>
             </w:rPr>
           </w:pPr>
-          <w:hyperlink w:anchor="_Toc242387737" w:history="1">
+          <w:hyperlink w:anchor="_Toc242394353" w:history="1">
             <w:r>
               <w:rPr>
                 <w:rStyle w:val="Hyperlink"/>
@@ -4246,7 +4246,7 @@
                 <w:noProof/>
                 <w:webHidden/>
               </w:rPr>
-              <w:instrText xml:space="preserve"> PAGEREF _Toc242387737 \h </w:instrText>
+              <w:instrText xml:space="preserve"> PAGEREF _Toc242394353 \h </w:instrText>
             </w:r>
             <w:r>
               <w:rPr>
@@ -4293,7 +4293,7 @@
               <w14:ligatures w14:val="standardContextual"/>
             </w:rPr>
           </w:pPr>
-          <w:hyperlink w:anchor="_Toc242387738" w:history="1">
+          <w:hyperlink w:anchor="_Toc242394354" w:history="1">
             <w:r>
               <w:rPr>
                 <w:rStyle w:val="Hyperlink"/>
@@ -4320,7 +4320,7 @@
                 <w:noProof/>
                 <w:webHidden/>
               </w:rPr>
-              <w:instrText xml:space="preserve"> PAGEREF _Toc242387738 \h </w:instrText>
+              <w:instrText xml:space="preserve"> PAGEREF _Toc242394354 \h </w:instrText>
             </w:r>
             <w:r>
               <w:rPr>
@@ -4367,7 +4367,7 @@
               <w14:ligatures w14:val="standardContextual"/>
             </w:rPr>
           </w:pPr>
-          <w:hyperlink w:anchor="_Toc242387739" w:history="1">
+          <w:hyperlink w:anchor="_Toc242394355" w:history="1">
             <w:r>
               <w:rPr>
                 <w:rStyle w:val="Hyperlink"/>
@@ -4409,7 +4409,7 @@
                 <w:noProof/>
                 <w:webHidden/>
               </w:rPr>
-              <w:instrText xml:space="preserve"> PAGEREF _Toc242387739 \h </w:instrText>
+              <w:instrText xml:space="preserve"> PAGEREF _Toc242394355 \h </w:instrText>
             </w:r>
             <w:r>
               <w:rPr>
@@ -4458,7 +4458,7 @@
               <w14:ligatures w14:val="standardContextual"/>
             </w:rPr>
           </w:pPr>
-          <w:hyperlink w:anchor="_Toc242387740" w:history="1">
+          <w:hyperlink w:anchor="_Toc242394356" w:history="1">
             <w:r>
               <w:rPr>
                 <w:rStyle w:val="Hyperlink"/>
@@ -4485,7 +4485,7 @@
                 <w:noProof/>
                 <w:webHidden/>
               </w:rPr>
-              <w:instrText xml:space="preserve"> PAGEREF _Toc242387740 \h </w:instrText>
+              <w:instrText xml:space="preserve"> PAGEREF _Toc242394356 \h </w:instrText>
             </w:r>
             <w:r>
               <w:rPr>
@@ -4532,7 +4532,7 @@
               <w14:ligatures w14:val="standardContextual"/>
             </w:rPr>
           </w:pPr>
-          <w:hyperlink w:anchor="_Toc242387741" w:history="1">
+          <w:hyperlink w:anchor="_Toc242394357" w:history="1">
             <w:r>
               <w:rPr>
                 <w:rStyle w:val="Hyperlink"/>
@@ -4559,7 +4559,7 @@
                 <w:noProof/>
                 <w:webHidden/>
               </w:rPr>
-              <w:instrText xml:space="preserve"> PAGEREF _Toc242387741 \h </w:instrText>
+              <w:instrText xml:space="preserve"> PAGEREF _Toc242394357 \h </w:instrText>
             </w:r>
             <w:r>
               <w:rPr>
@@ -4606,7 +4606,7 @@
               <w14:ligatures w14:val="standardContextual"/>
             </w:rPr>
           </w:pPr>
-          <w:hyperlink w:anchor="_Toc242387742" w:history="1">
+          <w:hyperlink w:anchor="_Toc242394358" w:history="1">
             <w:r>
               <w:rPr>
                 <w:rStyle w:val="Hyperlink"/>
@@ -4633,7 +4633,7 @@
                 <w:noProof/>
                 <w:webHidden/>
               </w:rPr>
-              <w:instrText xml:space="preserve"> PAGEREF _Toc242387742 \h </w:instrText>
+              <w:instrText xml:space="preserve"> PAGEREF _Toc242394358 \h </w:instrText>
             </w:r>
             <w:r>
               <w:rPr>
@@ -4680,7 +4680,7 @@
               <w14:ligatures w14:val="standardContextual"/>
             </w:rPr>
           </w:pPr>
-          <w:hyperlink w:anchor="_Toc242387743" w:history="1">
+          <w:hyperlink w:anchor="_Toc242394359" w:history="1">
             <w:r>
               <w:rPr>
                 <w:rStyle w:val="Hyperlink"/>
@@ -4715,7 +4715,7 @@
                 <w:noProof/>
                 <w:webHidden/>
               </w:rPr>
-              <w:instrText xml:space="preserve"> PAGEREF _Toc242387743 \h </w:instrText>
+              <w:instrText xml:space="preserve"> PAGEREF _Toc242394359 \h </w:instrText>
             </w:r>
             <w:r>
               <w:rPr>
@@ -4762,7 +4762,7 @@
               <w14:ligatures w14:val="standardContextual"/>
             </w:rPr>
           </w:pPr>
-          <w:hyperlink w:anchor="_Toc242387744" w:history="1">
+          <w:hyperlink w:anchor="_Toc242394360" w:history="1">
             <w:r>
               <w:rPr>
                 <w:rStyle w:val="Hyperlink"/>
@@ -4804,7 +4804,7 @@
                 <w:noProof/>
                 <w:webHidden/>
               </w:rPr>
-              <w:instrText xml:space="preserve"> PAGEREF _Toc242387744 \h </w:instrText>
+              <w:instrText xml:space="preserve"> PAGEREF _Toc242394360 \h </w:instrText>
             </w:r>
             <w:r>
               <w:rPr>
@@ -4851,7 +4851,7 @@
               <w14:ligatures w14:val="standardContextual"/>
             </w:rPr>
           </w:pPr>
-          <w:hyperlink w:anchor="_Toc242387745" w:history="1">
+          <w:hyperlink w:anchor="_Toc242394361" w:history="1">
             <w:r>
               <w:rPr>
                 <w:rStyle w:val="Hyperlink"/>
@@ -4894,7 +4894,7 @@
                 <w:noProof/>
                 <w:webHidden/>
               </w:rPr>
-              <w:instrText xml:space="preserve"> PAGEREF _Toc242387745 \h </w:instrText>
+              <w:instrText xml:space="preserve"> PAGEREF _Toc242394361 \h </w:instrText>
             </w:r>
             <w:r>
               <w:rPr>
@@ -4941,7 +4941,7 @@
               <w14:ligatures w14:val="standardContextual"/>
             </w:rPr>
           </w:pPr>
-          <w:hyperlink w:anchor="_Toc242387746" w:history="1">
+          <w:hyperlink w:anchor="_Toc242394362" w:history="1">
             <w:r>
               <w:rPr>
                 <w:rStyle w:val="Hyperlink"/>
@@ -4978,7 +4978,7 @@
                 <w:noProof/>
                 <w:webHidden/>
               </w:rPr>
-              <w:instrText xml:space="preserve"> PAGEREF _Toc242387746 \h </w:instrText>
+              <w:instrText xml:space="preserve"> PAGEREF _Toc242394362 \h </w:instrText>
             </w:r>
             <w:r>
               <w:rPr>
@@ -5025,7 +5025,7 @@
               <w14:ligatures w14:val="standardContextual"/>
             </w:rPr>
           </w:pPr>
-          <w:hyperlink w:anchor="_Toc242387747" w:history="1">
+          <w:hyperlink w:anchor="_Toc242394363" w:history="1">
             <w:r>
               <w:rPr>
                 <w:rStyle w:val="Hyperlink"/>
@@ -5053,7 +5053,7 @@
                 <w:noProof/>
                 <w:webHidden/>
               </w:rPr>
-              <w:instrText xml:space="preserve"> PAGEREF _Toc242387747 \h </w:instrText>
+              <w:instrText xml:space="preserve"> PAGEREF _Toc242394363 \h </w:instrText>
             </w:r>
             <w:r>
               <w:rPr>
@@ -5100,7 +5100,7 @@
               <w14:ligatures w14:val="standardContextual"/>
             </w:rPr>
           </w:pPr>
-          <w:hyperlink w:anchor="_Toc242387748" w:history="1">
+          <w:hyperlink w:anchor="_Toc242394364" w:history="1">
             <w:r>
               <w:rPr>
                 <w:rStyle w:val="Hyperlink"/>
@@ -5128,7 +5128,7 @@
                 <w:noProof/>
                 <w:webHidden/>
               </w:rPr>
-              <w:instrText xml:space="preserve"> PAGEREF _Toc242387748 \h </w:instrText>
+              <w:instrText xml:space="preserve"> PAGEREF _Toc242394364 \h </w:instrText>
             </w:r>
             <w:r>
               <w:rPr>
@@ -5175,7 +5175,7 @@
               <w14:ligatures w14:val="standardContextual"/>
             </w:rPr>
           </w:pPr>
-          <w:hyperlink w:anchor="_Toc242387749" w:history="1">
+          <w:hyperlink w:anchor="_Toc242394365" w:history="1">
             <w:r>
               <w:rPr>
                 <w:rStyle w:val="Hyperlink"/>
@@ -5234,7 +5234,7 @@
                 <w:noProof/>
                 <w:webHidden/>
               </w:rPr>
-              <w:instrText xml:space="preserve"> PAGEREF _Toc242387749 \h </w:instrText>
+              <w:instrText xml:space="preserve"> PAGEREF _Toc242394365 \h </w:instrText>
             </w:r>
             <w:r>
               <w:rPr>
@@ -5280,7 +5280,7 @@
               <w14:ligatures w14:val="standardContextual"/>
             </w:rPr>
           </w:pPr>
-          <w:hyperlink w:anchor="_Toc242387750" w:history="1">
+          <w:hyperlink w:anchor="_Toc242394366" w:history="1">
             <w:r>
               <w:rPr>
                 <w:rStyle w:val="Hyperlink"/>
@@ -5307,7 +5307,7 @@
                 <w:noProof/>
                 <w:webHidden/>
               </w:rPr>
-              <w:instrText xml:space="preserve"> PAGEREF _Toc242387750 \h </w:instrText>
+              <w:instrText xml:space="preserve"> PAGEREF _Toc242394366 \h </w:instrText>
             </w:r>
             <w:r>
               <w:rPr>
@@ -5356,7 +5356,7 @@
               <w14:ligatures w14:val="standardContextual"/>
             </w:rPr>
           </w:pPr>
-          <w:hyperlink w:anchor="_Toc242387751" w:history="1">
+          <w:hyperlink w:anchor="_Toc242394367" w:history="1">
             <w:r>
               <w:rPr>
                 <w:rStyle w:val="Hyperlink"/>
@@ -5383,7 +5383,7 @@
                 <w:noProof/>
                 <w:webHidden/>
               </w:rPr>
-              <w:instrText xml:space="preserve"> PAGEREF _Toc242387751 \h </w:instrText>
+              <w:instrText xml:space="preserve"> PAGEREF _Toc242394367 \h </w:instrText>
             </w:r>
             <w:r>
               <w:rPr>
@@ -5432,7 +5432,7 @@
               <w14:ligatures w14:val="standardContextual"/>
             </w:rPr>
           </w:pPr>
-          <w:hyperlink w:anchor="_Toc242387752" w:history="1">
+          <w:hyperlink w:anchor="_Toc242394368" w:history="1">
             <w:r>
               <w:rPr>
                 <w:rStyle w:val="Hyperlink"/>
@@ -5460,7 +5460,7 @@
                 <w:noProof/>
                 <w:webHidden/>
               </w:rPr>
-              <w:instrText xml:space="preserve"> PAGEREF _Toc242387752 \h </w:instrText>
+              <w:instrText xml:space="preserve"> PAGEREF _Toc242394368 \h </w:instrText>
             </w:r>
             <w:r>
               <w:rPr>
@@ -5509,7 +5509,7 @@
               <w14:ligatures w14:val="standardContextual"/>
             </w:rPr>
           </w:pPr>
-          <w:hyperlink w:anchor="_Toc242387753" w:history="1">
+          <w:hyperlink w:anchor="_Toc242394369" w:history="1">
             <w:r>
               <w:rPr>
                 <w:rStyle w:val="Hyperlink"/>
@@ -5546,7 +5546,7 @@
                 <w:noProof/>
                 <w:webHidden/>
               </w:rPr>
-              <w:instrText xml:space="preserve"> PAGEREF _Toc242387753 \h </w:instrText>
+              <w:instrText xml:space="preserve"> PAGEREF _Toc242394369 \h </w:instrText>
             </w:r>
             <w:r>
               <w:rPr>
@@ -5595,7 +5595,7 @@
               <w14:ligatures w14:val="standardContextual"/>
             </w:rPr>
           </w:pPr>
-          <w:hyperlink w:anchor="_Toc242387754" w:history="1">
+          <w:hyperlink w:anchor="_Toc242394370" w:history="1">
             <w:r>
               <w:rPr>
                 <w:rStyle w:val="Hyperlink"/>
@@ -5640,7 +5640,7 @@
                 <w:noProof/>
                 <w:webHidden/>
               </w:rPr>
-              <w:instrText xml:space="preserve"> PAGEREF _Toc242387754 \h </w:instrText>
+              <w:instrText xml:space="preserve"> PAGEREF _Toc242394370 \h </w:instrText>
             </w:r>
             <w:r>
               <w:rPr>
@@ -5689,7 +5689,7 @@
               <w14:ligatures w14:val="standardContextual"/>
             </w:rPr>
           </w:pPr>
-          <w:hyperlink w:anchor="_Toc242387755" w:history="1">
+          <w:hyperlink w:anchor="_Toc242394371" w:history="1">
             <w:r>
               <w:rPr>
                 <w:rStyle w:val="Hyperlink"/>
@@ -5724,7 +5724,7 @@
                 <w:noProof/>
                 <w:webHidden/>
               </w:rPr>
-              <w:instrText xml:space="preserve"> PAGEREF _Toc242387755 \h </w:instrText>
+              <w:instrText xml:space="preserve"> PAGEREF _Toc242394371 \h </w:instrText>
             </w:r>
             <w:r>
               <w:rPr>
@@ -5773,7 +5773,7 @@
               <w14:ligatures w14:val="standardContextual"/>
             </w:rPr>
           </w:pPr>
-          <w:hyperlink w:anchor="_Toc242387756" w:history="1">
+          <w:hyperlink w:anchor="_Toc242394372" w:history="1">
             <w:r>
               <w:rPr>
                 <w:rStyle w:val="Hyperlink"/>
@@ -5800,7 +5800,7 @@
                 <w:noProof/>
                 <w:webHidden/>
               </w:rPr>
-              <w:instrText xml:space="preserve"> PAGEREF _Toc242387756 \h </w:instrText>
+              <w:instrText xml:space="preserve"> PAGEREF _Toc242394372 \h </w:instrText>
             </w:r>
             <w:r>
               <w:rPr>
@@ -5847,7 +5847,7 @@
               <w14:ligatures w14:val="standardContextual"/>
             </w:rPr>
           </w:pPr>
-          <w:hyperlink w:anchor="_Toc242387757" w:history="1">
+          <w:hyperlink w:anchor="_Toc242394373" w:history="1">
             <w:r>
               <w:rPr>
                 <w:rStyle w:val="Hyperlink"/>
@@ -5875,7 +5875,7 @@
                 <w:noProof/>
                 <w:webHidden/>
               </w:rPr>
-              <w:instrText xml:space="preserve"> PAGEREF _Toc242387757 \h </w:instrText>
+              <w:instrText xml:space="preserve"> PAGEREF _Toc242394373 \h </w:instrText>
             </w:r>
             <w:r>
               <w:rPr>
@@ -5922,7 +5922,7 @@
               <w14:ligatures w14:val="standardContextual"/>
             </w:rPr>
           </w:pPr>
-          <w:hyperlink w:anchor="_Toc242387758" w:history="1">
+          <w:hyperlink w:anchor="_Toc242394374" w:history="1">
             <w:r>
               <w:rPr>
                 <w:rStyle w:val="Hyperlink"/>
@@ -5950,7 +5950,7 @@
                 <w:noProof/>
                 <w:webHidden/>
               </w:rPr>
-              <w:instrText xml:space="preserve"> PAGEREF _Toc242387758 \h </w:instrText>
+              <w:instrText xml:space="preserve"> PAGEREF _Toc242394374 \h </w:instrText>
             </w:r>
             <w:r>
               <w:rPr>
@@ -5997,7 +5997,7 @@
               <w14:ligatures w14:val="standardContextual"/>
             </w:rPr>
           </w:pPr>
-          <w:hyperlink w:anchor="_Toc242387759" w:history="1">
+          <w:hyperlink w:anchor="_Toc242394375" w:history="1">
             <w:r>
               <w:rPr>
                 <w:rStyle w:val="Hyperlink"/>
@@ -6025,7 +6025,7 @@
                 <w:noProof/>
                 <w:webHidden/>
               </w:rPr>
-              <w:instrText xml:space="preserve"> PAGEREF _Toc242387759 \h </w:instrText>
+              <w:instrText xml:space="preserve"> PAGEREF _Toc242394375 \h </w:instrText>
             </w:r>
             <w:r>
               <w:rPr>
@@ -6071,7 +6071,7 @@
               <w14:ligatures w14:val="standardContextual"/>
             </w:rPr>
           </w:pPr>
-          <w:hyperlink w:anchor="_Toc242387760" w:history="1">
+          <w:hyperlink w:anchor="_Toc242394376" w:history="1">
             <w:r>
               <w:rPr>
                 <w:rStyle w:val="Hyperlink"/>
@@ -6098,7 +6098,7 @@
                 <w:noProof/>
                 <w:webHidden/>
               </w:rPr>
-              <w:instrText xml:space="preserve"> PAGEREF _Toc242387760 \h </w:instrText>
+              <w:instrText xml:space="preserve"> PAGEREF _Toc242394376 \h </w:instrText>
             </w:r>
             <w:r>
               <w:rPr>
@@ -6147,7 +6147,7 @@
               <w14:ligatures w14:val="standardContextual"/>
             </w:rPr>
           </w:pPr>
-          <w:hyperlink w:anchor="_Toc242387761" w:history="1">
+          <w:hyperlink w:anchor="_Toc242394377" w:history="1">
             <w:r>
               <w:rPr>
                 <w:rStyle w:val="Hyperlink"/>
@@ -6175,7 +6175,7 @@
                 <w:noProof/>
                 <w:webHidden/>
               </w:rPr>
-              <w:instrText xml:space="preserve"> PAGEREF _Toc242387761 \h </w:instrText>
+              <w:instrText xml:space="preserve"> PAGEREF _Toc242394377 \h </w:instrText>
             </w:r>
             <w:r>
               <w:rPr>
@@ -6222,7 +6222,7 @@
               <w14:ligatures w14:val="standardContextual"/>
             </w:rPr>
           </w:pPr>
-          <w:hyperlink w:anchor="_Toc242387762" w:history="1">
+          <w:hyperlink w:anchor="_Toc242394378" w:history="1">
             <w:r>
               <w:rPr>
                 <w:rStyle w:val="Hyperlink"/>
@@ -6250,7 +6250,7 @@
                 <w:noProof/>
                 <w:webHidden/>
               </w:rPr>
-              <w:instrText xml:space="preserve"> PAGEREF _Toc242387762 \h </w:instrText>
+              <w:instrText xml:space="preserve"> PAGEREF _Toc242394378 \h </w:instrText>
             </w:r>
             <w:r>
               <w:rPr>
@@ -6297,7 +6297,7 @@
               <w14:ligatures w14:val="standardContextual"/>
             </w:rPr>
           </w:pPr>
-          <w:hyperlink w:anchor="_Toc242387763" w:history="1">
+          <w:hyperlink w:anchor="_Toc242394379" w:history="1">
             <w:r>
               <w:rPr>
                 <w:rStyle w:val="Hyperlink"/>
@@ -6340,7 +6340,7 @@
                 <w:noProof/>
                 <w:webHidden/>
               </w:rPr>
-              <w:instrText xml:space="preserve"> PAGEREF _Toc242387763 \h </w:instrText>
+              <w:instrText xml:space="preserve"> PAGEREF _Toc242394379 \h </w:instrText>
             </w:r>
             <w:r>
               <w:rPr>
@@ -6389,7 +6389,7 @@
               <w14:ligatures w14:val="standardContextual"/>
             </w:rPr>
           </w:pPr>
-          <w:hyperlink w:anchor="_Toc242387764" w:history="1">
+          <w:hyperlink w:anchor="_Toc242394380" w:history="1">
             <w:r>
               <w:rPr>
                 <w:rStyle w:val="Hyperlink"/>
@@ -6431,7 +6431,7 @@
                 <w:noProof/>
                 <w:webHidden/>
               </w:rPr>
-              <w:instrText xml:space="preserve"> PAGEREF _Toc242387764 \h </w:instrText>
+              <w:instrText xml:space="preserve"> PAGEREF _Toc242394380 \h </w:instrText>
             </w:r>
             <w:r>
               <w:rPr>
@@ -6478,7 +6478,7 @@
               <w14:ligatures w14:val="standardContextual"/>
             </w:rPr>
           </w:pPr>
-          <w:hyperlink w:anchor="_Toc242387765" w:history="1">
+          <w:hyperlink w:anchor="_Toc242394381" w:history="1">
             <w:r>
               <w:rPr>
                 <w:rStyle w:val="Hyperlink"/>
@@ -6506,7 +6506,7 @@
                 <w:noProof/>
                 <w:webHidden/>
               </w:rPr>
-              <w:instrText xml:space="preserve"> PAGEREF _Toc242387765 \h </w:instrText>
+              <w:instrText xml:space="preserve"> PAGEREF _Toc242394381 \h </w:instrText>
             </w:r>
             <w:r>
               <w:rPr>
@@ -6553,7 +6553,7 @@
               <w14:ligatures w14:val="standardContextual"/>
             </w:rPr>
           </w:pPr>
-          <w:hyperlink w:anchor="_Toc242387766" w:history="1">
+          <w:hyperlink w:anchor="_Toc242394382" w:history="1">
             <w:r>
               <w:rPr>
                 <w:rStyle w:val="Hyperlink"/>
@@ -6581,7 +6581,7 @@
                 <w:noProof/>
                 <w:webHidden/>
               </w:rPr>
-              <w:instrText xml:space="preserve"> PAGEREF _Toc242387766 \h </w:instrText>
+              <w:instrText xml:space="preserve"> PAGEREF _Toc242394382 \h </w:instrText>
             </w:r>
             <w:r>
               <w:rPr>
@@ -6628,7 +6628,7 @@
               <w14:ligatures w14:val="standardContextual"/>
             </w:rPr>
           </w:pPr>
-          <w:hyperlink w:anchor="_Toc242387767" w:history="1">
+          <w:hyperlink w:anchor="_Toc242394383" w:history="1">
             <w:r>
               <w:rPr>
                 <w:rStyle w:val="Hyperlink"/>
@@ -6656,7 +6656,7 @@
                 <w:noProof/>
                 <w:webHidden/>
               </w:rPr>
-              <w:instrText xml:space="preserve"> PAGEREF _Toc242387767 \h </w:instrText>
+              <w:instrText xml:space="preserve"> PAGEREF _Toc242394383 \h </w:instrText>
             </w:r>
             <w:r>
               <w:rPr>
@@ -6703,7 +6703,7 @@
               <w14:ligatures w14:val="standardContextual"/>
             </w:rPr>
           </w:pPr>
-          <w:hyperlink w:anchor="_Toc242387768" w:history="1">
+          <w:hyperlink w:anchor="_Toc242394384" w:history="1">
             <w:r>
               <w:rPr>
                 <w:rStyle w:val="Hyperlink"/>
@@ -6731,7 +6731,7 @@
                 <w:noProof/>
                 <w:webHidden/>
               </w:rPr>
-              <w:instrText xml:space="preserve"> PAGEREF _Toc242387768 \h </w:instrText>
+              <w:instrText xml:space="preserve"> PAGEREF _Toc242394384 \h </w:instrText>
             </w:r>
             <w:r>
               <w:rPr>
@@ -6778,7 +6778,7 @@
               <w14:ligatures w14:val="standardContextual"/>
             </w:rPr>
           </w:pPr>
-          <w:hyperlink w:anchor="_Toc242387769" w:history="1">
+          <w:hyperlink w:anchor="_Toc242394385" w:history="1">
             <w:r>
               <w:rPr>
                 <w:rStyle w:val="Hyperlink"/>
@@ -6837,7 +6837,7 @@
                 <w:noProof/>
                 <w:webHidden/>
               </w:rPr>
-              <w:instrText xml:space="preserve"> PAGEREF _Toc242387769 \h </w:instrText>
+              <w:instrText xml:space="preserve"> PAGEREF _Toc242394385 \h </w:instrText>
             </w:r>
             <w:r>
               <w:rPr>
@@ -6886,7 +6886,7 @@
               <w14:ligatures w14:val="standardContextual"/>
             </w:rPr>
           </w:pPr>
-          <w:hyperlink w:anchor="_Toc242387770" w:history="1">
+          <w:hyperlink w:anchor="_Toc242394386" w:history="1">
             <w:r>
               <w:rPr>
                 <w:rStyle w:val="Hyperlink"/>
@@ -6913,7 +6913,7 @@
                 <w:noProof/>
                 <w:webHidden/>
               </w:rPr>
-              <w:instrText xml:space="preserve"> PAGEREF _Toc242387770 \h </w:instrText>
+              <w:instrText xml:space="preserve"> PAGEREF _Toc242394386 \h </w:instrText>
             </w:r>
             <w:r>
               <w:rPr>
@@ -6959,7 +6959,7 @@
               <w14:ligatures w14:val="standardContextual"/>
             </w:rPr>
           </w:pPr>
-          <w:hyperlink w:anchor="_Toc242387771" w:history="1">
+          <w:hyperlink w:anchor="_Toc242394387" w:history="1">
             <w:r>
               <w:rPr>
                 <w:rStyle w:val="Hyperlink"/>
@@ -6987,7 +6987,7 @@
                 <w:noProof/>
                 <w:webHidden/>
               </w:rPr>
-              <w:instrText xml:space="preserve"> PAGEREF _Toc242387771 \h </w:instrText>
+              <w:instrText xml:space="preserve"> PAGEREF _Toc242394387 \h </w:instrText>
             </w:r>
             <w:r>
               <w:rPr>
@@ -7036,7 +7036,7 @@
               <w14:ligatures w14:val="standardContextual"/>
             </w:rPr>
           </w:pPr>
-          <w:hyperlink w:anchor="_Toc242387772" w:history="1">
+          <w:hyperlink w:anchor="_Toc242394388" w:history="1">
             <w:r>
               <w:rPr>
                 <w:rStyle w:val="Hyperlink"/>
@@ -7064,7 +7064,7 @@
                 <w:noProof/>
                 <w:webHidden/>
               </w:rPr>
-              <w:instrText xml:space="preserve"> PAGEREF _Toc242387772 \h </w:instrText>
+              <w:instrText xml:space="preserve"> PAGEREF _Toc242394388 \h </w:instrText>
             </w:r>
             <w:r>
               <w:rPr>
@@ -7113,7 +7113,7 @@
               <w14:ligatures w14:val="standardContextual"/>
             </w:rPr>
           </w:pPr>
-          <w:hyperlink w:anchor="_Toc242387773" w:history="1">
+          <w:hyperlink w:anchor="_Toc242394389" w:history="1">
             <w:r>
               <w:rPr>
                 <w:rStyle w:val="Hyperlink"/>
@@ -7141,7 +7141,7 @@
                 <w:noProof/>
                 <w:webHidden/>
               </w:rPr>
-              <w:instrText xml:space="preserve"> PAGEREF _Toc242387773 \h </w:instrText>
+              <w:instrText xml:space="preserve"> PAGEREF _Toc242394389 \h </w:instrText>
             </w:r>
             <w:r>
               <w:rPr>
@@ -7187,7 +7187,7 @@
               <w14:ligatures w14:val="standardContextual"/>
             </w:rPr>
           </w:pPr>
-          <w:hyperlink w:anchor="_Toc242387774" w:history="1">
+          <w:hyperlink w:anchor="_Toc242394390" w:history="1">
             <w:r>
               <w:rPr>
                 <w:rStyle w:val="Hyperlink"/>
@@ -7214,7 +7214,7 @@
                 <w:noProof/>
                 <w:webHidden/>
               </w:rPr>
-              <w:instrText xml:space="preserve"> PAGEREF _Toc242387774 \h </w:instrText>
+              <w:instrText xml:space="preserve"> PAGEREF _Toc242394390 \h </w:instrText>
             </w:r>
             <w:r>
               <w:rPr>
@@ -7279,7 +7279,7 @@
       </w:pPr>
       <w:bookmarkStart w:id="2" w:name="_Ref402284383"/>
       <w:bookmarkStart w:id="3" w:name="_Toc402485258"/>
-      <w:bookmarkStart w:id="4" w:name="_Toc242387691"/>
+      <w:bookmarkStart w:id="4" w:name="_Toc242394307"/>
       <w:r>
         <w:lastRenderedPageBreak/>
         <w:t>DAFTAR TABEL</w:t>
@@ -7310,7 +7310,7 @@
           <w14:ligatures w14:val="standardContextual"/>
         </w:rPr>
       </w:pPr>
-      <w:hyperlink w:anchor="_Toc242387775" w:history="1">
+      <w:hyperlink w:anchor="_Toc242394391" w:history="1">
         <w:r>
           <w:rPr>
             <w:rStyle w:val="Hyperlink"/>
@@ -7337,7 +7337,7 @@
             <w:noProof/>
             <w:webHidden/>
           </w:rPr>
-          <w:instrText xml:space="preserve"> PAGEREF _Toc242387775 \h </w:instrText>
+          <w:instrText xml:space="preserve"> PAGEREF _Toc242394391 \h </w:instrText>
         </w:r>
         <w:r>
           <w:rPr>
@@ -7418,7 +7418,7 @@
           <w14:ligatures w14:val="standardContextual"/>
         </w:rPr>
       </w:pPr>
-      <w:hyperlink w:anchor="_Toc242387776" w:history="1">
+      <w:hyperlink w:anchor="_Toc242394392" w:history="1">
         <w:r>
           <w:rPr>
             <w:rStyle w:val="Hyperlink"/>
@@ -7454,7 +7454,7 @@
             <w:noProof/>
             <w:webHidden/>
           </w:rPr>
-          <w:instrText xml:space="preserve"> PAGEREF _Toc242387776 \h </w:instrText>
+          <w:instrText xml:space="preserve"> PAGEREF _Toc242394392 \h </w:instrText>
         </w:r>
         <w:r>
           <w:rPr>
@@ -7500,7 +7500,7 @@
           <w14:ligatures w14:val="standardContextual"/>
         </w:rPr>
       </w:pPr>
-      <w:hyperlink w:anchor="_Toc242387777" w:history="1">
+      <w:hyperlink w:anchor="_Toc242394393" w:history="1">
         <w:r>
           <w:rPr>
             <w:rStyle w:val="Hyperlink"/>
@@ -7547,7 +7547,7 @@
             <w:noProof/>
             <w:webHidden/>
           </w:rPr>
-          <w:instrText xml:space="preserve"> PAGEREF _Toc242387777 \h </w:instrText>
+          <w:instrText xml:space="preserve"> PAGEREF _Toc242394393 \h </w:instrText>
         </w:r>
         <w:r>
           <w:rPr>
@@ -7593,7 +7593,7 @@
           <w14:ligatures w14:val="standardContextual"/>
         </w:rPr>
       </w:pPr>
-      <w:hyperlink w:anchor="_Toc242387778" w:history="1">
+      <w:hyperlink w:anchor="_Toc242394394" w:history="1">
         <w:r>
           <w:rPr>
             <w:rStyle w:val="Hyperlink"/>
@@ -7648,7 +7648,7 @@
             <w:noProof/>
             <w:webHidden/>
           </w:rPr>
-          <w:instrText xml:space="preserve"> PAGEREF _Toc242387778 \h </w:instrText>
+          <w:instrText xml:space="preserve"> PAGEREF _Toc242394394 \h </w:instrText>
         </w:r>
         <w:r>
           <w:rPr>
@@ -7694,7 +7694,7 @@
           <w14:ligatures w14:val="standardContextual"/>
         </w:rPr>
       </w:pPr>
-      <w:hyperlink w:anchor="_Toc242387779" w:history="1">
+      <w:hyperlink w:anchor="_Toc242394395" w:history="1">
         <w:r>
           <w:rPr>
             <w:rStyle w:val="Hyperlink"/>
@@ -7749,7 +7749,7 @@
             <w:noProof/>
             <w:webHidden/>
           </w:rPr>
-          <w:instrText xml:space="preserve"> PAGEREF _Toc242387779 \h </w:instrText>
+          <w:instrText xml:space="preserve"> PAGEREF _Toc242394395 \h </w:instrText>
         </w:r>
         <w:r>
           <w:rPr>
@@ -7795,7 +7795,7 @@
           <w14:ligatures w14:val="standardContextual"/>
         </w:rPr>
       </w:pPr>
-      <w:hyperlink w:anchor="_Toc242387780" w:history="1">
+      <w:hyperlink w:anchor="_Toc242394396" w:history="1">
         <w:r>
           <w:rPr>
             <w:rStyle w:val="Hyperlink"/>
@@ -7831,7 +7831,7 @@
             <w:noProof/>
             <w:webHidden/>
           </w:rPr>
-          <w:instrText xml:space="preserve"> PAGEREF _Toc242387780 \h </w:instrText>
+          <w:instrText xml:space="preserve"> PAGEREF _Toc242394396 \h </w:instrText>
         </w:r>
         <w:r>
           <w:rPr>
@@ -7877,7 +7877,7 @@
           <w14:ligatures w14:val="standardContextual"/>
         </w:rPr>
       </w:pPr>
-      <w:hyperlink w:anchor="_Toc242387781" w:history="1">
+      <w:hyperlink w:anchor="_Toc242394397" w:history="1">
         <w:r>
           <w:rPr>
             <w:rStyle w:val="Hyperlink"/>
@@ -7913,7 +7913,7 @@
             <w:noProof/>
             <w:webHidden/>
           </w:rPr>
-          <w:instrText xml:space="preserve"> PAGEREF _Toc242387781 \h </w:instrText>
+          <w:instrText xml:space="preserve"> PAGEREF _Toc242394397 \h </w:instrText>
         </w:r>
         <w:r>
           <w:rPr>
@@ -7959,7 +7959,7 @@
           <w14:ligatures w14:val="standardContextual"/>
         </w:rPr>
       </w:pPr>
-      <w:hyperlink w:anchor="_Toc242387782" w:history="1">
+      <w:hyperlink w:anchor="_Toc242394398" w:history="1">
         <w:r>
           <w:rPr>
             <w:rStyle w:val="Hyperlink"/>
@@ -7986,7 +7986,7 @@
             <w:noProof/>
             <w:webHidden/>
           </w:rPr>
-          <w:instrText xml:space="preserve"> PAGEREF _Toc242387782 \h </w:instrText>
+          <w:instrText xml:space="preserve"> PAGEREF _Toc242394398 \h </w:instrText>
         </w:r>
         <w:r>
           <w:rPr>
@@ -8032,7 +8032,7 @@
           <w14:ligatures w14:val="standardContextual"/>
         </w:rPr>
       </w:pPr>
-      <w:hyperlink w:anchor="_Toc242387783" w:history="1">
+      <w:hyperlink w:anchor="_Toc242394399" w:history="1">
         <w:r>
           <w:rPr>
             <w:rStyle w:val="Hyperlink"/>
@@ -8068,7 +8068,7 @@
             <w:noProof/>
             <w:webHidden/>
           </w:rPr>
-          <w:instrText xml:space="preserve"> PAGEREF _Toc242387783 \h </w:instrText>
+          <w:instrText xml:space="preserve"> PAGEREF _Toc242394399 \h </w:instrText>
         </w:r>
         <w:r>
           <w:rPr>
@@ -8114,7 +8114,7 @@
           <w14:ligatures w14:val="standardContextual"/>
         </w:rPr>
       </w:pPr>
-      <w:hyperlink w:anchor="_Toc242387784" w:history="1">
+      <w:hyperlink w:anchor="_Toc242394400" w:history="1">
         <w:r>
           <w:rPr>
             <w:rStyle w:val="Hyperlink"/>
@@ -8160,7 +8160,7 @@
             <w:noProof/>
             <w:webHidden/>
           </w:rPr>
-          <w:instrText xml:space="preserve"> PAGEREF _Toc242387784 \h </w:instrText>
+          <w:instrText xml:space="preserve"> PAGEREF _Toc242394400 \h </w:instrText>
         </w:r>
         <w:r>
           <w:rPr>
@@ -8206,7 +8206,7 @@
           <w14:ligatures w14:val="standardContextual"/>
         </w:rPr>
       </w:pPr>
-      <w:hyperlink w:anchor="_Toc242387785" w:history="1">
+      <w:hyperlink w:anchor="_Toc242394401" w:history="1">
         <w:r>
           <w:rPr>
             <w:rStyle w:val="Hyperlink"/>
@@ -8233,7 +8233,7 @@
             <w:noProof/>
             <w:webHidden/>
           </w:rPr>
-          <w:instrText xml:space="preserve"> PAGEREF _Toc242387785 \h </w:instrText>
+          <w:instrText xml:space="preserve"> PAGEREF _Toc242394401 \h </w:instrText>
         </w:r>
         <w:r>
           <w:rPr>
@@ -8279,7 +8279,7 @@
           <w14:ligatures w14:val="standardContextual"/>
         </w:rPr>
       </w:pPr>
-      <w:hyperlink w:anchor="_Toc242387786" w:history="1">
+      <w:hyperlink w:anchor="_Toc242394402" w:history="1">
         <w:r>
           <w:rPr>
             <w:rStyle w:val="Hyperlink"/>
@@ -8334,7 +8334,7 @@
             <w:noProof/>
             <w:webHidden/>
           </w:rPr>
-          <w:instrText xml:space="preserve"> PAGEREF _Toc242387786 \h </w:instrText>
+          <w:instrText xml:space="preserve"> PAGEREF _Toc242394402 \h </w:instrText>
         </w:r>
         <w:r>
           <w:rPr>
@@ -8380,7 +8380,7 @@
           <w14:ligatures w14:val="standardContextual"/>
         </w:rPr>
       </w:pPr>
-      <w:hyperlink w:anchor="_Toc242387787" w:history="1">
+      <w:hyperlink w:anchor="_Toc242394403" w:history="1">
         <w:r>
           <w:rPr>
             <w:rStyle w:val="Hyperlink"/>
@@ -8426,7 +8426,7 @@
             <w:noProof/>
             <w:webHidden/>
           </w:rPr>
-          <w:instrText xml:space="preserve"> PAGEREF _Toc242387787 \h </w:instrText>
+          <w:instrText xml:space="preserve"> PAGEREF _Toc242394403 \h </w:instrText>
         </w:r>
         <w:r>
           <w:rPr>
@@ -8472,7 +8472,7 @@
           <w14:ligatures w14:val="standardContextual"/>
         </w:rPr>
       </w:pPr>
-      <w:hyperlink w:anchor="_Toc242387788" w:history="1">
+      <w:hyperlink w:anchor="_Toc242394404" w:history="1">
         <w:r>
           <w:rPr>
             <w:rStyle w:val="Hyperlink"/>
@@ -8518,7 +8518,7 @@
             <w:noProof/>
             <w:webHidden/>
           </w:rPr>
-          <w:instrText xml:space="preserve"> PAGEREF _Toc242387788 \h </w:instrText>
+          <w:instrText xml:space="preserve"> PAGEREF _Toc242394404 \h </w:instrText>
         </w:r>
         <w:r>
           <w:rPr>
@@ -8564,7 +8564,7 @@
           <w14:ligatures w14:val="standardContextual"/>
         </w:rPr>
       </w:pPr>
-      <w:hyperlink w:anchor="_Toc242387789" w:history="1">
+      <w:hyperlink w:anchor="_Toc242394405" w:history="1">
         <w:r>
           <w:rPr>
             <w:rStyle w:val="Hyperlink"/>
@@ -8610,7 +8610,7 @@
             <w:noProof/>
             <w:webHidden/>
           </w:rPr>
-          <w:instrText xml:space="preserve"> PAGEREF _Toc242387789 \h </w:instrText>
+          <w:instrText xml:space="preserve"> PAGEREF _Toc242394405 \h </w:instrText>
         </w:r>
         <w:r>
           <w:rPr>
@@ -8656,7 +8656,7 @@
           <w14:ligatures w14:val="standardContextual"/>
         </w:rPr>
       </w:pPr>
-      <w:hyperlink w:anchor="_Toc242387790" w:history="1">
+      <w:hyperlink w:anchor="_Toc242394406" w:history="1">
         <w:r>
           <w:rPr>
             <w:rStyle w:val="Hyperlink"/>
@@ -8691,7 +8691,7 @@
             <w:noProof/>
             <w:webHidden/>
           </w:rPr>
-          <w:instrText xml:space="preserve"> PAGEREF _Toc242387790 \h </w:instrText>
+          <w:instrText xml:space="preserve"> PAGEREF _Toc242394406 \h </w:instrText>
         </w:r>
         <w:r>
           <w:rPr>
@@ -8737,7 +8737,7 @@
           <w14:ligatures w14:val="standardContextual"/>
         </w:rPr>
       </w:pPr>
-      <w:hyperlink w:anchor="_Toc242387791" w:history="1">
+      <w:hyperlink w:anchor="_Toc242394407" w:history="1">
         <w:r>
           <w:rPr>
             <w:rStyle w:val="Hyperlink"/>
@@ -8773,7 +8773,7 @@
             <w:noProof/>
             <w:webHidden/>
           </w:rPr>
-          <w:instrText xml:space="preserve"> PAGEREF _Toc242387791 \h </w:instrText>
+          <w:instrText xml:space="preserve"> PAGEREF _Toc242394407 \h </w:instrText>
         </w:r>
         <w:r>
           <w:rPr>
@@ -8819,7 +8819,7 @@
           <w14:ligatures w14:val="standardContextual"/>
         </w:rPr>
       </w:pPr>
-      <w:hyperlink w:anchor="_Toc242387792" w:history="1">
+      <w:hyperlink w:anchor="_Toc242394408" w:history="1">
         <w:r>
           <w:rPr>
             <w:rStyle w:val="Hyperlink"/>
@@ -8855,7 +8855,7 @@
             <w:noProof/>
             <w:webHidden/>
           </w:rPr>
-          <w:instrText xml:space="preserve"> PAGEREF _Toc242387792 \h </w:instrText>
+          <w:instrText xml:space="preserve"> PAGEREF _Toc242394408 \h </w:instrText>
         </w:r>
         <w:r>
           <w:rPr>
@@ -8936,7 +8936,7 @@
           <w14:ligatures w14:val="standardContextual"/>
         </w:rPr>
       </w:pPr>
-      <w:hyperlink w:anchor="_Toc242387793" w:history="1">
+      <w:hyperlink w:anchor="_Toc242394409" w:history="1">
         <w:r>
           <w:rPr>
             <w:rStyle w:val="Hyperlink"/>
@@ -8963,7 +8963,7 @@
             <w:noProof/>
             <w:webHidden/>
           </w:rPr>
-          <w:instrText xml:space="preserve"> PAGEREF _Toc242387793 \h </w:instrText>
+          <w:instrText xml:space="preserve"> PAGEREF _Toc242394409 \h </w:instrText>
         </w:r>
         <w:r>
           <w:rPr>
@@ -9009,7 +9009,7 @@
           <w14:ligatures w14:val="standardContextual"/>
         </w:rPr>
       </w:pPr>
-      <w:hyperlink w:anchor="_Toc242387794" w:history="1">
+      <w:hyperlink w:anchor="_Toc242394410" w:history="1">
         <w:r>
           <w:rPr>
             <w:rStyle w:val="Hyperlink"/>
@@ -9036,7 +9036,7 @@
             <w:noProof/>
             <w:webHidden/>
           </w:rPr>
-          <w:instrText xml:space="preserve"> PAGEREF _Toc242387794 \h </w:instrText>
+          <w:instrText xml:space="preserve"> PAGEREF _Toc242394410 \h </w:instrText>
         </w:r>
         <w:r>
           <w:rPr>
@@ -9082,7 +9082,7 @@
           <w14:ligatures w14:val="standardContextual"/>
         </w:rPr>
       </w:pPr>
-      <w:hyperlink w:anchor="_Toc242387795" w:history="1">
+      <w:hyperlink w:anchor="_Toc242394411" w:history="1">
         <w:r>
           <w:rPr>
             <w:rStyle w:val="Hyperlink"/>
@@ -9109,7 +9109,7 @@
             <w:noProof/>
             <w:webHidden/>
           </w:rPr>
-          <w:instrText xml:space="preserve"> PAGEREF _Toc242387795 \h </w:instrText>
+          <w:instrText xml:space="preserve"> PAGEREF _Toc242394411 \h </w:instrText>
         </w:r>
         <w:r>
           <w:rPr>
@@ -9155,7 +9155,7 @@
           <w14:ligatures w14:val="standardContextual"/>
         </w:rPr>
       </w:pPr>
-      <w:hyperlink w:anchor="_Toc242387796" w:history="1">
+      <w:hyperlink w:anchor="_Toc242394412" w:history="1">
         <w:r>
           <w:rPr>
             <w:rStyle w:val="Hyperlink"/>
@@ -9182,7 +9182,7 @@
             <w:noProof/>
             <w:webHidden/>
           </w:rPr>
-          <w:instrText xml:space="preserve"> PAGEREF _Toc242387796 \h </w:instrText>
+          <w:instrText xml:space="preserve"> PAGEREF _Toc242394412 \h </w:instrText>
         </w:r>
         <w:r>
           <w:rPr>
@@ -9228,7 +9228,7 @@
           <w14:ligatures w14:val="standardContextual"/>
         </w:rPr>
       </w:pPr>
-      <w:hyperlink w:anchor="_Toc242387797" w:history="1">
+      <w:hyperlink w:anchor="_Toc242394413" w:history="1">
         <w:r>
           <w:rPr>
             <w:rStyle w:val="Hyperlink"/>
@@ -9255,7 +9255,7 @@
             <w:noProof/>
             <w:webHidden/>
           </w:rPr>
-          <w:instrText xml:space="preserve"> PAGEREF _Toc242387797 \h </w:instrText>
+          <w:instrText xml:space="preserve"> PAGEREF _Toc242394413 \h </w:instrText>
         </w:r>
         <w:r>
           <w:rPr>
@@ -9301,7 +9301,7 @@
           <w14:ligatures w14:val="standardContextual"/>
         </w:rPr>
       </w:pPr>
-      <w:hyperlink w:anchor="_Toc242387798" w:history="1">
+      <w:hyperlink w:anchor="_Toc242394414" w:history="1">
         <w:r>
           <w:rPr>
             <w:rStyle w:val="Hyperlink"/>
@@ -9328,7 +9328,7 @@
             <w:noProof/>
             <w:webHidden/>
           </w:rPr>
-          <w:instrText xml:space="preserve"> PAGEREF _Toc242387798 \h </w:instrText>
+          <w:instrText xml:space="preserve"> PAGEREF _Toc242394414 \h </w:instrText>
         </w:r>
         <w:r>
           <w:rPr>
@@ -9374,7 +9374,7 @@
           <w14:ligatures w14:val="standardContextual"/>
         </w:rPr>
       </w:pPr>
-      <w:hyperlink w:anchor="_Toc242387799" w:history="1">
+      <w:hyperlink w:anchor="_Toc242394415" w:history="1">
         <w:r>
           <w:rPr>
             <w:rStyle w:val="Hyperlink"/>
@@ -9401,7 +9401,7 @@
             <w:noProof/>
             <w:webHidden/>
           </w:rPr>
-          <w:instrText xml:space="preserve"> PAGEREF _Toc242387799 \h </w:instrText>
+          <w:instrText xml:space="preserve"> PAGEREF _Toc242394415 \h </w:instrText>
         </w:r>
         <w:r>
           <w:rPr>
@@ -9447,7 +9447,7 @@
           <w14:ligatures w14:val="standardContextual"/>
         </w:rPr>
       </w:pPr>
-      <w:hyperlink w:anchor="_Toc242387800" w:history="1">
+      <w:hyperlink w:anchor="_Toc242394416" w:history="1">
         <w:r>
           <w:rPr>
             <w:rStyle w:val="Hyperlink"/>
@@ -9474,7 +9474,7 @@
             <w:noProof/>
             <w:webHidden/>
           </w:rPr>
-          <w:instrText xml:space="preserve"> PAGEREF _Toc242387800 \h </w:instrText>
+          <w:instrText xml:space="preserve"> PAGEREF _Toc242394416 \h </w:instrText>
         </w:r>
         <w:r>
           <w:rPr>
@@ -9520,7 +9520,7 @@
           <w14:ligatures w14:val="standardContextual"/>
         </w:rPr>
       </w:pPr>
-      <w:hyperlink w:anchor="_Toc242387801" w:history="1">
+      <w:hyperlink w:anchor="_Toc242394417" w:history="1">
         <w:r>
           <w:rPr>
             <w:rStyle w:val="Hyperlink"/>
@@ -9555,7 +9555,7 @@
             <w:noProof/>
             <w:webHidden/>
           </w:rPr>
-          <w:instrText xml:space="preserve"> PAGEREF _Toc242387801 \h </w:instrText>
+          <w:instrText xml:space="preserve"> PAGEREF _Toc242394417 \h </w:instrText>
         </w:r>
         <w:r>
           <w:rPr>
@@ -9601,7 +9601,7 @@
           <w14:ligatures w14:val="standardContextual"/>
         </w:rPr>
       </w:pPr>
-      <w:hyperlink w:anchor="_Toc242387802" w:history="1">
+      <w:hyperlink w:anchor="_Toc242394418" w:history="1">
         <w:r>
           <w:rPr>
             <w:rStyle w:val="Hyperlink"/>
@@ -9636,7 +9636,7 @@
             <w:noProof/>
             <w:webHidden/>
           </w:rPr>
-          <w:instrText xml:space="preserve"> PAGEREF _Toc242387802 \h </w:instrText>
+          <w:instrText xml:space="preserve"> PAGEREF _Toc242394418 \h </w:instrText>
         </w:r>
         <w:r>
           <w:rPr>
@@ -9682,7 +9682,7 @@
           <w14:ligatures w14:val="standardContextual"/>
         </w:rPr>
       </w:pPr>
-      <w:hyperlink w:anchor="_Toc242387803" w:history="1">
+      <w:hyperlink w:anchor="_Toc242394419" w:history="1">
         <w:r>
           <w:rPr>
             <w:rStyle w:val="Hyperlink"/>
@@ -9717,7 +9717,7 @@
             <w:noProof/>
             <w:webHidden/>
           </w:rPr>
-          <w:instrText xml:space="preserve"> PAGEREF _Toc242387803 \h </w:instrText>
+          <w:instrText xml:space="preserve"> PAGEREF _Toc242394419 \h </w:instrText>
         </w:r>
         <w:r>
           <w:rPr>
@@ -9763,7 +9763,7 @@
           <w14:ligatures w14:val="standardContextual"/>
         </w:rPr>
       </w:pPr>
-      <w:hyperlink w:anchor="_Toc242387804" w:history="1">
+      <w:hyperlink w:anchor="_Toc242394420" w:history="1">
         <w:r>
           <w:rPr>
             <w:rStyle w:val="Hyperlink"/>
@@ -9790,7 +9790,7 @@
             <w:noProof/>
             <w:webHidden/>
           </w:rPr>
-          <w:instrText xml:space="preserve"> PAGEREF _Toc242387804 \h </w:instrText>
+          <w:instrText xml:space="preserve"> PAGEREF _Toc242394420 \h </w:instrText>
         </w:r>
         <w:r>
           <w:rPr>
@@ -9841,7 +9841,7 @@
           <w:caps w:val="0"/>
         </w:rPr>
       </w:pPr>
-      <w:bookmarkStart w:id="5" w:name="_Toc242387692"/>
+      <w:bookmarkStart w:id="5" w:name="_Toc242394308"/>
       <w:r>
         <w:rPr>
           <w:caps w:val="0"/>
@@ -9884,7 +9884,7 @@
         </w:rPr>
         <w:fldChar w:fldCharType="separate"/>
       </w:r>
-      <w:hyperlink w:anchor="_Toc242387805" w:history="1">
+      <w:hyperlink w:anchor="_Toc242394421" w:history="1">
         <w:r>
           <w:rPr>
             <w:rStyle w:val="Hyperlink"/>
@@ -9911,7 +9911,7 @@
             <w:noProof/>
             <w:webHidden/>
           </w:rPr>
-          <w:instrText xml:space="preserve"> PAGEREF _Toc242387805 \h </w:instrText>
+          <w:instrText xml:space="preserve"> PAGEREF _Toc242394421 \h </w:instrText>
         </w:r>
         <w:r>
           <w:rPr>
@@ -9992,7 +9992,7 @@
           <w14:ligatures w14:val="standardContextual"/>
         </w:rPr>
       </w:pPr>
-      <w:hyperlink w:anchor="_Toc242387806" w:history="1">
+      <w:hyperlink w:anchor="_Toc242394422" w:history="1">
         <w:r>
           <w:rPr>
             <w:rStyle w:val="Hyperlink"/>
@@ -10028,7 +10028,7 @@
             <w:noProof/>
             <w:webHidden/>
           </w:rPr>
-          <w:instrText xml:space="preserve"> PAGEREF _Toc242387806 \h </w:instrText>
+          <w:instrText xml:space="preserve"> PAGEREF _Toc242394422 \h </w:instrText>
         </w:r>
         <w:r>
           <w:rPr>
@@ -10074,7 +10074,7 @@
           <w14:ligatures w14:val="standardContextual"/>
         </w:rPr>
       </w:pPr>
-      <w:hyperlink w:anchor="_Toc242387807" w:history="1">
+      <w:hyperlink w:anchor="_Toc242394423" w:history="1">
         <w:r>
           <w:rPr>
             <w:rStyle w:val="Hyperlink"/>
@@ -10110,7 +10110,7 @@
             <w:noProof/>
             <w:webHidden/>
           </w:rPr>
-          <w:instrText xml:space="preserve"> PAGEREF _Toc242387807 \h </w:instrText>
+          <w:instrText xml:space="preserve"> PAGEREF _Toc242394423 \h </w:instrText>
         </w:r>
         <w:r>
           <w:rPr>
@@ -10156,7 +10156,7 @@
           <w14:ligatures w14:val="standardContextual"/>
         </w:rPr>
       </w:pPr>
-      <w:hyperlink w:anchor="_Toc242387808" w:history="1">
+      <w:hyperlink w:anchor="_Toc242394424" w:history="1">
         <w:r>
           <w:rPr>
             <w:rStyle w:val="Hyperlink"/>
@@ -10192,7 +10192,7 @@
             <w:noProof/>
             <w:webHidden/>
           </w:rPr>
-          <w:instrText xml:space="preserve"> PAGEREF _Toc242387808 \h </w:instrText>
+          <w:instrText xml:space="preserve"> PAGEREF _Toc242394424 \h </w:instrText>
         </w:r>
         <w:r>
           <w:rPr>
@@ -10238,7 +10238,7 @@
           <w14:ligatures w14:val="standardContextual"/>
         </w:rPr>
       </w:pPr>
-      <w:hyperlink w:anchor="_Toc242387809" w:history="1">
+      <w:hyperlink w:anchor="_Toc242394425" w:history="1">
         <w:r>
           <w:rPr>
             <w:rStyle w:val="Hyperlink"/>
@@ -10282,7 +10282,7 @@
             <w:noProof/>
             <w:webHidden/>
           </w:rPr>
-          <w:instrText xml:space="preserve"> PAGEREF _Toc242387809 \h </w:instrText>
+          <w:instrText xml:space="preserve"> PAGEREF _Toc242394425 \h </w:instrText>
         </w:r>
         <w:r>
           <w:rPr>
@@ -10328,7 +10328,7 @@
           <w14:ligatures w14:val="standardContextual"/>
         </w:rPr>
       </w:pPr>
-      <w:hyperlink w:anchor="_Toc242387810" w:history="1">
+      <w:hyperlink w:anchor="_Toc242394426" w:history="1">
         <w:r>
           <w:rPr>
             <w:rStyle w:val="Hyperlink"/>
@@ -10363,7 +10363,7 @@
             <w:noProof/>
             <w:webHidden/>
           </w:rPr>
-          <w:instrText xml:space="preserve"> PAGEREF _Toc242387810 \h </w:instrText>
+          <w:instrText xml:space="preserve"> PAGEREF _Toc242394426 \h </w:instrText>
         </w:r>
         <w:r>
           <w:rPr>
@@ -10409,7 +10409,7 @@
           <w14:ligatures w14:val="standardContextual"/>
         </w:rPr>
       </w:pPr>
-      <w:hyperlink w:anchor="_Toc242387811" w:history="1">
+      <w:hyperlink w:anchor="_Toc242394427" w:history="1">
         <w:r>
           <w:rPr>
             <w:rStyle w:val="Hyperlink"/>
@@ -10445,7 +10445,7 @@
             <w:noProof/>
             <w:webHidden/>
           </w:rPr>
-          <w:instrText xml:space="preserve"> PAGEREF _Toc242387811 \h </w:instrText>
+          <w:instrText xml:space="preserve"> PAGEREF _Toc242394427 \h </w:instrText>
         </w:r>
         <w:r>
           <w:rPr>
@@ -10491,7 +10491,7 @@
           <w14:ligatures w14:val="standardContextual"/>
         </w:rPr>
       </w:pPr>
-      <w:hyperlink w:anchor="_Toc242387812" w:history="1">
+      <w:hyperlink w:anchor="_Toc242394428" w:history="1">
         <w:r>
           <w:rPr>
             <w:rStyle w:val="Hyperlink"/>
@@ -10527,7 +10527,7 @@
             <w:noProof/>
             <w:webHidden/>
           </w:rPr>
-          <w:instrText xml:space="preserve"> PAGEREF _Toc242387812 \h </w:instrText>
+          <w:instrText xml:space="preserve"> PAGEREF _Toc242394428 \h </w:instrText>
         </w:r>
         <w:r>
           <w:rPr>
@@ -10608,7 +10608,7 @@
           <w14:ligatures w14:val="standardContextual"/>
         </w:rPr>
       </w:pPr>
-      <w:hyperlink w:anchor="_Toc242387813" w:history="1">
+      <w:hyperlink w:anchor="_Toc242394429" w:history="1">
         <w:r>
           <w:rPr>
             <w:rStyle w:val="Hyperlink"/>
@@ -10660,7 +10660,7 @@
             <w:noProof/>
             <w:webHidden/>
           </w:rPr>
-          <w:instrText xml:space="preserve"> PAGEREF _Toc242387813 \h </w:instrText>
+          <w:instrText xml:space="preserve"> PAGEREF _Toc242394429 \h </w:instrText>
         </w:r>
         <w:r>
           <w:rPr>
@@ -10709,7 +10709,7 @@
         <w:pStyle w:val="Judul1"/>
       </w:pPr>
       <w:bookmarkStart w:id="6" w:name="_H1_51"/>
-      <w:bookmarkStart w:id="7" w:name="_Toc242387693"/>
+      <w:bookmarkStart w:id="7" w:name="_Toc242394309"/>
       <w:bookmarkEnd w:id="2"/>
       <w:bookmarkEnd w:id="3"/>
       <w:r>
@@ -10724,7 +10724,7 @@
         <w:pStyle w:val="Judul2"/>
       </w:pPr>
       <w:bookmarkStart w:id="8" w:name="_H2_52"/>
-      <w:bookmarkStart w:id="9" w:name="_Toc242387694"/>
+      <w:bookmarkStart w:id="9" w:name="_Toc242394310"/>
       <w:r>
         <w:t>Latar Belakang</w:t>
       </w:r>
@@ -11082,7 +11082,7 @@
         <w:pStyle w:val="Judul2"/>
       </w:pPr>
       <w:bookmarkStart w:id="10" w:name="_H2_53"/>
-      <w:bookmarkStart w:id="11" w:name="_Toc242387695"/>
+      <w:bookmarkStart w:id="11" w:name="_Toc242394311"/>
       <w:r>
         <w:t>Rumusan Masalah</w:t>
       </w:r>
@@ -11199,7 +11199,7 @@
         <w:pStyle w:val="Judul2"/>
       </w:pPr>
       <w:bookmarkStart w:id="12" w:name="_H2_54"/>
-      <w:bookmarkStart w:id="13" w:name="_Toc242387696"/>
+      <w:bookmarkStart w:id="13" w:name="_Toc242394312"/>
       <w:r>
         <w:t>Tujuan</w:t>
       </w:r>
@@ -11317,7 +11317,7 @@
         <w:pStyle w:val="Judul2"/>
       </w:pPr>
       <w:bookmarkStart w:id="14" w:name="_H2_55"/>
-      <w:bookmarkStart w:id="15" w:name="_Toc242387697"/>
+      <w:bookmarkStart w:id="15" w:name="_Toc242394313"/>
       <w:r>
         <w:t>Manfaat</w:t>
       </w:r>
@@ -11410,7 +11410,7 @@
         <w:pStyle w:val="Judul2"/>
       </w:pPr>
       <w:bookmarkStart w:id="16" w:name="_Toc900001"/>
-      <w:bookmarkStart w:id="17" w:name="_Toc242387698"/>
+      <w:bookmarkStart w:id="17" w:name="_Toc242394314"/>
       <w:r>
         <w:lastRenderedPageBreak/>
         <w:t>Kontribusi Penelitian</w:t>
@@ -11616,7 +11616,7 @@
         <w:pStyle w:val="Judul2"/>
       </w:pPr>
       <w:bookmarkStart w:id="18" w:name="_H2_56"/>
-      <w:bookmarkStart w:id="19" w:name="_Toc242387699"/>
+      <w:bookmarkStart w:id="19" w:name="_Toc242394315"/>
       <w:r>
         <w:lastRenderedPageBreak/>
         <w:t>Batasan Masalah</w:t>
@@ -11900,7 +11900,7 @@
       <w:pPr>
         <w:pStyle w:val="Judul2"/>
       </w:pPr>
-      <w:bookmarkStart w:id="21" w:name="_Toc242387700"/>
+      <w:bookmarkStart w:id="21" w:name="_Toc242394316"/>
       <w:r>
         <w:t>Sistematika Pembahasan</w:t>
       </w:r>
@@ -12230,7 +12230,7 @@
         <w:pStyle w:val="Judul1"/>
       </w:pPr>
       <w:bookmarkStart w:id="22" w:name="_H1_58"/>
-      <w:bookmarkStart w:id="23" w:name="_Toc242387701"/>
+      <w:bookmarkStart w:id="23" w:name="_Toc242394317"/>
       <w:r>
         <w:lastRenderedPageBreak/>
         <w:t>LANDASAN KEPUSTAKAAN</w:t>
@@ -12243,7 +12243,7 @@
         <w:pStyle w:val="Judul2"/>
       </w:pPr>
       <w:bookmarkStart w:id="24" w:name="_H2_59"/>
-      <w:bookmarkStart w:id="25" w:name="_Toc242387702"/>
+      <w:bookmarkStart w:id="25" w:name="_Toc242394318"/>
       <w:r>
         <w:t>Kajian Pustaka</w:t>
       </w:r>
@@ -12329,7 +12329,7 @@
         <w:pStyle w:val="Keterangan"/>
       </w:pPr>
       <w:bookmarkStart w:id="26" w:name="_Toc241153418"/>
-      <w:bookmarkStart w:id="27" w:name="_Toc242387775"/>
+      <w:bookmarkStart w:id="27" w:name="_Toc242394391"/>
       <w:r>
         <w:t xml:space="preserve">Tabel 2. </w:t>
       </w:r>
@@ -13434,7 +13434,7 @@
         <w:pStyle w:val="Judul2"/>
       </w:pPr>
       <w:bookmarkStart w:id="28" w:name="_H3_61"/>
-      <w:bookmarkStart w:id="29" w:name="_Toc242387703"/>
+      <w:bookmarkStart w:id="29" w:name="_Toc242394319"/>
       <w:r>
         <w:lastRenderedPageBreak/>
         <w:t>Tata Kelola Sektor Publik</w:t>
@@ -13538,7 +13538,7 @@
         <w:ind w:left="1080" w:hanging="1080"/>
       </w:pPr>
       <w:bookmarkStart w:id="30" w:name="_H3_62"/>
-      <w:bookmarkStart w:id="31" w:name="_Toc242387704"/>
+      <w:bookmarkStart w:id="31" w:name="_Toc242394320"/>
       <w:r>
         <w:t>Aspek Tata Kelola dalam Penelitian</w:t>
       </w:r>
@@ -13699,7 +13699,7 @@
         <w:ind w:left="1080" w:hanging="1080"/>
       </w:pPr>
       <w:bookmarkStart w:id="32" w:name="_H3_63"/>
-      <w:bookmarkStart w:id="33" w:name="_Toc242387705"/>
+      <w:bookmarkStart w:id="33" w:name="_Toc242394321"/>
       <w:r>
         <w:lastRenderedPageBreak/>
         <w:t>Opini Publik di Media Sosial</w:t>
@@ -13786,7 +13786,7 @@
       <w:pPr>
         <w:pStyle w:val="Judul3"/>
       </w:pPr>
-      <w:bookmarkStart w:id="34" w:name="_Toc242387706"/>
+      <w:bookmarkStart w:id="34" w:name="_Toc242394322"/>
       <w:r>
         <w:t>TikTok sebagai Sumber Data Opini Publik</w:t>
       </w:r>
@@ -13885,7 +13885,7 @@
         <w:pStyle w:val="Judul2"/>
       </w:pPr>
       <w:bookmarkStart w:id="35" w:name="_H2_64"/>
-      <w:bookmarkStart w:id="36" w:name="_Toc242387707"/>
+      <w:bookmarkStart w:id="36" w:name="_Toc242394323"/>
       <w:r>
         <w:rPr>
           <w:i/>
@@ -14025,7 +14025,7 @@
         <w:ind w:left="1080" w:hanging="1080"/>
       </w:pPr>
       <w:bookmarkStart w:id="37" w:name="_H3_65"/>
-      <w:bookmarkStart w:id="38" w:name="_Toc242387708"/>
+      <w:bookmarkStart w:id="38" w:name="_Toc242394324"/>
       <w:r>
         <w:rPr>
           <w:i/>
@@ -14082,7 +14082,7 @@
         <w:ind w:left="1080" w:hanging="1080"/>
       </w:pPr>
       <w:bookmarkStart w:id="39" w:name="_H3_66"/>
-      <w:bookmarkStart w:id="40" w:name="_Toc242387709"/>
+      <w:bookmarkStart w:id="40" w:name="_Toc242394325"/>
       <w:r>
         <w:lastRenderedPageBreak/>
         <w:t>Analisis Sentimen</w:t>
@@ -14139,7 +14139,7 @@
         <w:pStyle w:val="Judul3"/>
         <w:ind w:left="1080" w:hanging="1080"/>
       </w:pPr>
-      <w:bookmarkStart w:id="41" w:name="_Toc242387710"/>
+      <w:bookmarkStart w:id="41" w:name="_Toc242394326"/>
       <w:r>
         <w:rPr>
           <w:i/>
@@ -14191,7 +14191,7 @@
           <w:iCs/>
         </w:rPr>
       </w:pPr>
-      <w:bookmarkStart w:id="42" w:name="_Toc242387711"/>
+      <w:bookmarkStart w:id="42" w:name="_Toc242394327"/>
       <w:r>
         <w:t xml:space="preserve">IndoBERT dan </w:t>
       </w:r>
@@ -14372,7 +14372,7 @@
         <w:pStyle w:val="Judul3"/>
         <w:ind w:left="1080" w:hanging="1080"/>
       </w:pPr>
-      <w:bookmarkStart w:id="43" w:name="_Toc242387712"/>
+      <w:bookmarkStart w:id="43" w:name="_Toc242394328"/>
       <w:r>
         <w:t>IndoBERT</w:t>
       </w:r>
@@ -14459,7 +14459,7 @@
         <w:pStyle w:val="Judul3"/>
         <w:ind w:left="1080" w:hanging="1080"/>
       </w:pPr>
-      <w:bookmarkStart w:id="44" w:name="_Toc242387713"/>
+      <w:bookmarkStart w:id="44" w:name="_Toc242394329"/>
       <w:r>
         <w:rPr>
           <w:i/>
@@ -14702,7 +14702,7 @@
       <w:pPr>
         <w:pStyle w:val="Judul3"/>
       </w:pPr>
-      <w:bookmarkStart w:id="45" w:name="_Toc242387714"/>
+      <w:bookmarkStart w:id="45" w:name="_Toc242394330"/>
       <w:r>
         <w:rPr>
           <w:i/>
@@ -14881,7 +14881,7 @@
           <w:lang w:eastAsia="id-ID"/>
         </w:rPr>
       </w:pPr>
-      <w:bookmarkStart w:id="46" w:name="_Toc242387715"/>
+      <w:bookmarkStart w:id="46" w:name="_Toc242394331"/>
       <w:r>
         <w:rPr>
           <w:i/>
@@ -15145,7 +15145,7 @@
           <w:lang w:eastAsia="id-ID"/>
         </w:rPr>
       </w:pPr>
-      <w:bookmarkStart w:id="47" w:name="_Toc242387716"/>
+      <w:bookmarkStart w:id="47" w:name="_Toc242394332"/>
       <w:r>
         <w:rPr>
           <w:i/>
@@ -15296,7 +15296,7 @@
           <w:lang w:eastAsia="id-ID"/>
         </w:rPr>
       </w:pPr>
-      <w:bookmarkStart w:id="48" w:name="_Toc242387717"/>
+      <w:bookmarkStart w:id="48" w:name="_Toc242394333"/>
       <w:r>
         <w:rPr>
           <w:i/>
@@ -15511,7 +15511,7 @@
           <w:lang w:eastAsia="id-ID"/>
         </w:rPr>
       </w:pPr>
-      <w:bookmarkStart w:id="49" w:name="_Toc242387718"/>
+      <w:bookmarkStart w:id="49" w:name="_Toc242394334"/>
       <w:r>
         <w:rPr>
           <w:lang w:eastAsia="id-ID"/>
@@ -16641,7 +16641,7 @@
           <w:lang w:eastAsia="id-ID"/>
         </w:rPr>
       </w:pPr>
-      <w:bookmarkStart w:id="50" w:name="_Toc242387719"/>
+      <w:bookmarkStart w:id="50" w:name="_Toc242394335"/>
       <w:r>
         <w:rPr>
           <w:iCs/>
@@ -16823,7 +16823,7 @@
           <w:lang w:eastAsia="id-ID"/>
         </w:rPr>
       </w:pPr>
-      <w:bookmarkStart w:id="51" w:name="_Toc242387720"/>
+      <w:bookmarkStart w:id="51" w:name="_Toc242394336"/>
       <w:r>
         <w:rPr>
           <w:i/>
@@ -17096,7 +17096,7 @@
         <w:pStyle w:val="Judul2"/>
       </w:pPr>
       <w:bookmarkStart w:id="52" w:name="_H2_71"/>
-      <w:bookmarkStart w:id="53" w:name="_Toc242387721"/>
+      <w:bookmarkStart w:id="53" w:name="_Toc242394337"/>
       <w:r>
         <w:t>Pengumpulan dan Pengolahan Data Komentar T</w:t>
       </w:r>
@@ -17403,7 +17403,7 @@
         <w:pStyle w:val="Judul1"/>
       </w:pPr>
       <w:bookmarkStart w:id="54" w:name="_H1_74"/>
-      <w:bookmarkStart w:id="55" w:name="_Toc242387722"/>
+      <w:bookmarkStart w:id="55" w:name="_Toc242394338"/>
       <w:r>
         <w:lastRenderedPageBreak/>
         <w:t>METODOLOGI PENELITIAN</w:t>
@@ -17415,7 +17415,7 @@
         <w:pStyle w:val="Judul2"/>
       </w:pPr>
       <w:bookmarkStart w:id="56" w:name="_H2_75"/>
-      <w:bookmarkStart w:id="57" w:name="_Toc242387723"/>
+      <w:bookmarkStart w:id="57" w:name="_Toc242394339"/>
       <w:r>
         <w:t>Tipe Penelitian</w:t>
       </w:r>
@@ -17471,7 +17471,7 @@
         <w:pStyle w:val="Judul2"/>
       </w:pPr>
       <w:bookmarkStart w:id="58" w:name="_H2_76"/>
-      <w:bookmarkStart w:id="59" w:name="_Toc242387724"/>
+      <w:bookmarkStart w:id="59" w:name="_Toc242394340"/>
       <w:r>
         <w:t>Data Penelitian</w:t>
       </w:r>
@@ -17602,7 +17602,7 @@
       <w:pPr>
         <w:pStyle w:val="Judul3"/>
       </w:pPr>
-      <w:bookmarkStart w:id="60" w:name="_Toc242387725"/>
+      <w:bookmarkStart w:id="60" w:name="_Toc242394341"/>
       <w:r>
         <w:lastRenderedPageBreak/>
         <w:t>Sumber data</w:t>
@@ -17663,7 +17663,7 @@
         <w:ind w:left="1080" w:hanging="1080"/>
       </w:pPr>
       <w:bookmarkStart w:id="61" w:name="_H3_78"/>
-      <w:bookmarkStart w:id="62" w:name="_Toc242387726"/>
+      <w:bookmarkStart w:id="62" w:name="_Toc242394342"/>
       <w:r>
         <w:t>Karakteristik Data</w:t>
       </w:r>
@@ -17775,7 +17775,7 @@
         <w:pStyle w:val="Judul2"/>
       </w:pPr>
       <w:bookmarkStart w:id="63" w:name="_H2_79"/>
-      <w:bookmarkStart w:id="64" w:name="_Toc242387727"/>
+      <w:bookmarkStart w:id="64" w:name="_Toc242394343"/>
       <w:r>
         <w:lastRenderedPageBreak/>
         <w:t>Teknik Pengumpulan Data</w:t>
@@ -17839,7 +17839,7 @@
         <w:ind w:left="1080" w:hanging="1080"/>
       </w:pPr>
       <w:bookmarkStart w:id="65" w:name="_H3_80"/>
-      <w:bookmarkStart w:id="66" w:name="_Toc242387728"/>
+      <w:bookmarkStart w:id="66" w:name="_Toc242394344"/>
       <w:r>
         <w:rPr>
           <w:i/>
@@ -17968,7 +17968,7 @@
         <w:ind w:left="1080" w:hanging="1080"/>
       </w:pPr>
       <w:bookmarkStart w:id="67" w:name="_H3_81"/>
-      <w:bookmarkStart w:id="68" w:name="_Toc242387729"/>
+      <w:bookmarkStart w:id="68" w:name="_Toc242394345"/>
       <w:r>
         <w:t>Penentuan Kata Kunci</w:t>
       </w:r>
@@ -18012,7 +18012,7 @@
         <w:pStyle w:val="Judul3"/>
         <w:ind w:left="1080" w:hanging="1080"/>
       </w:pPr>
-      <w:bookmarkStart w:id="69" w:name="_Toc242387730"/>
+      <w:bookmarkStart w:id="69" w:name="_Toc242394346"/>
       <w:r>
         <w:t>Seleksi Relevansi Data</w:t>
       </w:r>
@@ -18245,7 +18245,7 @@
         <w:pStyle w:val="Judul2"/>
       </w:pPr>
       <w:bookmarkStart w:id="70" w:name="_H2_83"/>
-      <w:bookmarkStart w:id="71" w:name="_Toc242387731"/>
+      <w:bookmarkStart w:id="71" w:name="_Toc242394347"/>
       <w:r>
         <w:t>Teknik Pengolahan Data</w:t>
       </w:r>
@@ -18381,7 +18381,7 @@
         <w:pStyle w:val="Judul3"/>
         <w:ind w:left="1080" w:hanging="1080"/>
       </w:pPr>
-      <w:bookmarkStart w:id="72" w:name="_Toc242387732"/>
+      <w:bookmarkStart w:id="72" w:name="_Toc242394348"/>
       <w:r>
         <w:rPr>
           <w:i/>
@@ -18915,7 +18915,7 @@
       <w:pPr>
         <w:pStyle w:val="Judul3"/>
       </w:pPr>
-      <w:bookmarkStart w:id="73" w:name="_Toc242387733"/>
+      <w:bookmarkStart w:id="73" w:name="_Toc242394349"/>
       <w:r>
         <w:t xml:space="preserve">Text </w:t>
       </w:r>
@@ -19120,7 +19120,7 @@
         <w:pStyle w:val="Judul2"/>
       </w:pPr>
       <w:bookmarkStart w:id="74" w:name="_H2_86"/>
-      <w:bookmarkStart w:id="75" w:name="_Toc242387734"/>
+      <w:bookmarkStart w:id="75" w:name="_Toc242394350"/>
       <w:r>
         <w:t>Teknik Analisis Data</w:t>
       </w:r>
@@ -19304,7 +19304,7 @@
         <w:pStyle w:val="Judul3"/>
         <w:ind w:left="1080" w:hanging="1080"/>
       </w:pPr>
-      <w:bookmarkStart w:id="76" w:name="_Toc242387735"/>
+      <w:bookmarkStart w:id="76" w:name="_Toc242394351"/>
       <w:r>
         <w:rPr>
           <w:i/>
@@ -19575,7 +19575,7 @@
       <w:pPr>
         <w:pStyle w:val="Judul3"/>
       </w:pPr>
-      <w:bookmarkStart w:id="77" w:name="_Toc242387736"/>
+      <w:bookmarkStart w:id="77" w:name="_Toc242394352"/>
       <w:r>
         <w:rPr>
           <w:i/>
@@ -19943,7 +19943,7 @@
       <w:pPr>
         <w:pStyle w:val="Judul3"/>
       </w:pPr>
-      <w:bookmarkStart w:id="78" w:name="_Toc242387737"/>
+      <w:bookmarkStart w:id="78" w:name="_Toc242394353"/>
       <w:r>
         <w:t>Prediksi Seluruh Komentar</w:t>
       </w:r>
@@ -20150,7 +20150,7 @@
         <w:pStyle w:val="Judul3"/>
         <w:ind w:left="1080" w:hanging="1080"/>
       </w:pPr>
-      <w:bookmarkStart w:id="79" w:name="_Toc242387738"/>
+      <w:bookmarkStart w:id="79" w:name="_Toc242394354"/>
       <w:r>
         <w:t>Identifikasi Permasalahan Berbasis Hasil Analisis Sentimen</w:t>
       </w:r>
@@ -20238,7 +20238,7 @@
       <w:pPr>
         <w:pStyle w:val="Judul3"/>
       </w:pPr>
-      <w:bookmarkStart w:id="80" w:name="_Toc242387739"/>
+      <w:bookmarkStart w:id="80" w:name="_Toc242394355"/>
       <w:r>
         <w:rPr>
           <w:i/>
@@ -20457,7 +20457,7 @@
         <w:pStyle w:val="Judul2"/>
       </w:pPr>
       <w:bookmarkStart w:id="81" w:name="_H2_90"/>
-      <w:bookmarkStart w:id="82" w:name="_Toc242387740"/>
+      <w:bookmarkStart w:id="82" w:name="_Toc242394356"/>
       <w:r>
         <w:t>Flowchart Penelitian</w:t>
       </w:r>
@@ -20918,7 +20918,7 @@
                                 <w:szCs w:val="22"/>
                               </w:rPr>
                             </w:pPr>
-                            <w:bookmarkStart w:id="83" w:name="_Toc242387805"/>
+                            <w:bookmarkStart w:id="83" w:name="_Toc242394421"/>
                             <w:r>
                               <w:t xml:space="preserve">Gambar 3. </w:t>
                             </w:r>
@@ -20976,7 +20976,7 @@
                           <w:szCs w:val="22"/>
                         </w:rPr>
                       </w:pPr>
-                      <w:bookmarkStart w:id="84" w:name="_Toc242387805"/>
+                      <w:bookmarkStart w:id="84" w:name="_Toc242394421"/>
                       <w:r>
                         <w:t xml:space="preserve">Gambar 3. </w:t>
                       </w:r>
@@ -21050,7 +21050,7 @@
         <w:ind w:left="1080" w:hanging="1080"/>
       </w:pPr>
       <w:bookmarkStart w:id="85" w:name="_H3_91"/>
-      <w:bookmarkStart w:id="86" w:name="_Toc242387741"/>
+      <w:bookmarkStart w:id="86" w:name="_Toc242394357"/>
       <w:r>
         <w:t>Pengumpulan Data</w:t>
       </w:r>
@@ -21108,7 +21108,7 @@
         <w:pStyle w:val="Judul3"/>
         <w:ind w:left="1080" w:hanging="1080"/>
       </w:pPr>
-      <w:bookmarkStart w:id="87" w:name="_Toc242387742"/>
+      <w:bookmarkStart w:id="87" w:name="_Toc242394358"/>
       <w:r>
         <w:t>Pelabelan Data</w:t>
       </w:r>
@@ -21175,7 +21175,7 @@
       <w:pPr>
         <w:pStyle w:val="Judul3"/>
       </w:pPr>
-      <w:bookmarkStart w:id="88" w:name="_Toc242387743"/>
+      <w:bookmarkStart w:id="88" w:name="_Toc242394359"/>
       <w:r>
         <w:rPr>
           <w:i/>
@@ -21302,7 +21302,7 @@
       <w:pPr>
         <w:pStyle w:val="Judul3"/>
       </w:pPr>
-      <w:bookmarkStart w:id="89" w:name="_Toc242387744"/>
+      <w:bookmarkStart w:id="89" w:name="_Toc242394360"/>
       <w:r>
         <w:rPr>
           <w:i/>
@@ -21428,7 +21428,7 @@
         <w:pStyle w:val="Judul3"/>
         <w:ind w:left="1080" w:hanging="1080"/>
       </w:pPr>
-      <w:bookmarkStart w:id="90" w:name="_Toc242387745"/>
+      <w:bookmarkStart w:id="90" w:name="_Toc242394361"/>
       <w:r>
         <w:rPr>
           <w:i/>
@@ -21510,7 +21510,7 @@
           <w:lang w:eastAsia="id-ID"/>
         </w:rPr>
       </w:pPr>
-      <w:bookmarkStart w:id="91" w:name="_Toc242387746"/>
+      <w:bookmarkStart w:id="91" w:name="_Toc242394362"/>
       <w:r>
         <w:rPr>
           <w:i/>
@@ -21695,7 +21695,7 @@
           <w:lang w:eastAsia="id-ID"/>
         </w:rPr>
       </w:pPr>
-      <w:bookmarkStart w:id="92" w:name="_Toc242387747"/>
+      <w:bookmarkStart w:id="92" w:name="_Toc242394363"/>
       <w:r>
         <w:rPr>
           <w:lang w:eastAsia="id-ID"/>
@@ -21766,7 +21766,7 @@
           <w:lang w:eastAsia="id-ID"/>
         </w:rPr>
       </w:pPr>
-      <w:bookmarkStart w:id="93" w:name="_Toc242387748"/>
+      <w:bookmarkStart w:id="93" w:name="_Toc242394364"/>
       <w:r>
         <w:rPr>
           <w:lang w:eastAsia="id-ID"/>
@@ -21836,7 +21836,7 @@
       <w:pPr>
         <w:pStyle w:val="Judul3"/>
       </w:pPr>
-      <w:bookmarkStart w:id="94" w:name="_Toc242387749"/>
+      <w:bookmarkStart w:id="94" w:name="_Toc242394365"/>
       <w:r>
         <w:rPr>
           <w:i/>
@@ -21900,7 +21900,7 @@
       <w:pPr>
         <w:pStyle w:val="Judul1"/>
       </w:pPr>
-      <w:bookmarkStart w:id="95" w:name="_Toc242387750"/>
+      <w:bookmarkStart w:id="95" w:name="_Toc242394366"/>
       <w:r>
         <w:lastRenderedPageBreak/>
         <w:t>ANALISIS SENTIMEN BERBASIS ASPEK MENGGUNAKAN INDOBERT</w:t>
@@ -21911,7 +21911,7 @@
       <w:pPr>
         <w:pStyle w:val="Judul2"/>
       </w:pPr>
-      <w:bookmarkStart w:id="96" w:name="_Toc242387751"/>
+      <w:bookmarkStart w:id="96" w:name="_Toc242394367"/>
       <w:r>
         <w:t>Pengumpulan Data</w:t>
       </w:r>
@@ -22197,7 +22197,7 @@
       </w:pPr>
       <w:bookmarkStart w:id="97" w:name="_Toc241153405"/>
       <w:bookmarkStart w:id="98" w:name="_Toc241153466"/>
-      <w:bookmarkStart w:id="99" w:name="_Toc242387776"/>
+      <w:bookmarkStart w:id="99" w:name="_Toc242394392"/>
       <w:r>
         <w:t xml:space="preserve">Tabel 4. </w:t>
       </w:r>
@@ -22888,7 +22888,7 @@
       </w:pPr>
       <w:bookmarkStart w:id="100" w:name="_Toc241153406"/>
       <w:bookmarkStart w:id="101" w:name="_Toc241153467"/>
-      <w:bookmarkStart w:id="102" w:name="_Toc242387777"/>
+      <w:bookmarkStart w:id="102" w:name="_Toc242394393"/>
       <w:r>
         <w:lastRenderedPageBreak/>
         <w:t xml:space="preserve">Tabel 4. </w:t>
@@ -23820,7 +23820,7 @@
           <w:lang w:eastAsia="id-ID"/>
         </w:rPr>
       </w:pPr>
-      <w:bookmarkStart w:id="103" w:name="_Toc242387752"/>
+      <w:bookmarkStart w:id="103" w:name="_Toc242394368"/>
       <w:r>
         <w:rPr>
           <w:lang w:eastAsia="id-ID"/>
@@ -24154,7 +24154,7 @@
       <w:pPr>
         <w:pStyle w:val="Keterangan"/>
       </w:pPr>
-      <w:bookmarkStart w:id="104" w:name="_Toc242387778"/>
+      <w:bookmarkStart w:id="104" w:name="_Toc242394394"/>
       <w:r>
         <w:t xml:space="preserve">Tabel 4. </w:t>
       </w:r>
@@ -25134,7 +25134,7 @@
       <w:pPr>
         <w:pStyle w:val="Keterangan"/>
       </w:pPr>
-      <w:bookmarkStart w:id="105" w:name="_Toc242387779"/>
+      <w:bookmarkStart w:id="105" w:name="_Toc242394395"/>
       <w:r>
         <w:t xml:space="preserve">Tabel 4. </w:t>
       </w:r>
@@ -26380,7 +26380,7 @@
       <w:pPr>
         <w:pStyle w:val="Keterangan"/>
       </w:pPr>
-      <w:bookmarkStart w:id="106" w:name="_Toc242387780"/>
+      <w:bookmarkStart w:id="106" w:name="_Toc242394396"/>
       <w:r>
         <w:lastRenderedPageBreak/>
         <w:t xml:space="preserve">Tabel 4. </w:t>
@@ -27507,7 +27507,7 @@
       <w:pPr>
         <w:pStyle w:val="Keterangan"/>
       </w:pPr>
-      <w:bookmarkStart w:id="107" w:name="_Toc242387781"/>
+      <w:bookmarkStart w:id="107" w:name="_Toc242394397"/>
       <w:r>
         <w:t xml:space="preserve">Tabel 4. </w:t>
       </w:r>
@@ -27972,7 +27972,7 @@
                 <w:lang w:eastAsia="id-ID"/>
               </w:rPr>
             </w:pPr>
-            <w:bookmarkStart w:id="108" w:name="_Toc242387806"/>
+            <w:bookmarkStart w:id="108" w:name="_Toc242394422"/>
             <w:r>
               <w:t xml:space="preserve">Gambar 4. </w:t>
             </w:r>
@@ -28033,7 +28033,7 @@
       <w:pPr>
         <w:pStyle w:val="Keterangan"/>
       </w:pPr>
-      <w:bookmarkStart w:id="109" w:name="_Toc242387782"/>
+      <w:bookmarkStart w:id="109" w:name="_Toc242394398"/>
       <w:r>
         <w:t xml:space="preserve">Tabel 4. </w:t>
       </w:r>
@@ -28366,7 +28366,7 @@
                 <w:lang w:eastAsia="id-ID"/>
               </w:rPr>
             </w:pPr>
-            <w:bookmarkStart w:id="110" w:name="_Toc242387807"/>
+            <w:bookmarkStart w:id="110" w:name="_Toc242394423"/>
             <w:r>
               <w:t xml:space="preserve">Gambar 4. </w:t>
             </w:r>
@@ -28445,7 +28445,7 @@
       <w:pPr>
         <w:pStyle w:val="Keterangan"/>
       </w:pPr>
-      <w:bookmarkStart w:id="111" w:name="_Toc242387783"/>
+      <w:bookmarkStart w:id="111" w:name="_Toc242394399"/>
       <w:r>
         <w:t xml:space="preserve">Tabel 4. </w:t>
       </w:r>
@@ -29158,7 +29158,7 @@
                 <w:lang w:eastAsia="id-ID"/>
               </w:rPr>
             </w:pPr>
-            <w:bookmarkStart w:id="112" w:name="_Toc242387808"/>
+            <w:bookmarkStart w:id="112" w:name="_Toc242394424"/>
             <w:r>
               <w:t xml:space="preserve">Gambar 4. </w:t>
             </w:r>
@@ -29240,7 +29240,7 @@
           <w:lang w:eastAsia="id-ID"/>
         </w:rPr>
       </w:pPr>
-      <w:bookmarkStart w:id="113" w:name="_Toc242387753"/>
+      <w:bookmarkStart w:id="113" w:name="_Toc242394369"/>
       <w:r>
         <w:rPr>
           <w:lang w:eastAsia="id-ID"/>
@@ -29811,7 +29811,7 @@
       <w:pPr>
         <w:pStyle w:val="Keterangan"/>
       </w:pPr>
-      <w:bookmarkStart w:id="114" w:name="_Toc242387784"/>
+      <w:bookmarkStart w:id="114" w:name="_Toc242394400"/>
       <w:r>
         <w:t xml:space="preserve">Tabel 4. </w:t>
       </w:r>
@@ -31605,7 +31605,7 @@
           <w:lang w:eastAsia="id-ID"/>
         </w:rPr>
       </w:pPr>
-      <w:bookmarkStart w:id="115" w:name="_Toc242387754"/>
+      <w:bookmarkStart w:id="115" w:name="_Toc242394370"/>
       <w:r>
         <w:rPr>
           <w:i/>
@@ -32108,7 +32108,7 @@
       <w:pPr>
         <w:pStyle w:val="Keterangan"/>
       </w:pPr>
-      <w:bookmarkStart w:id="116" w:name="_Toc242387785"/>
+      <w:bookmarkStart w:id="116" w:name="_Toc242394401"/>
       <w:r>
         <w:lastRenderedPageBreak/>
         <w:t xml:space="preserve">Tabel 4. </w:t>
@@ -33980,7 +33980,7 @@
       <w:pPr>
         <w:pStyle w:val="Keterangan"/>
       </w:pPr>
-      <w:bookmarkStart w:id="117" w:name="_Toc242387786"/>
+      <w:bookmarkStart w:id="117" w:name="_Toc242394402"/>
       <w:r>
         <w:t xml:space="preserve">Tabel 4. </w:t>
       </w:r>
@@ -34762,7 +34762,7 @@
       <w:pPr>
         <w:pStyle w:val="Judul2"/>
       </w:pPr>
-      <w:bookmarkStart w:id="118" w:name="_Toc242387755"/>
+      <w:bookmarkStart w:id="118" w:name="_Toc242394371"/>
       <w:r>
         <w:rPr>
           <w:i/>
@@ -35204,7 +35204,7 @@
       <w:pPr>
         <w:pStyle w:val="Keterangan"/>
       </w:pPr>
-      <w:bookmarkStart w:id="119" w:name="_Toc242387787"/>
+      <w:bookmarkStart w:id="119" w:name="_Toc242394403"/>
       <w:r>
         <w:lastRenderedPageBreak/>
         <w:t xml:space="preserve">Tabel 4. </w:t>
@@ -37055,7 +37055,7 @@
       <w:pPr>
         <w:pStyle w:val="Keterangan"/>
       </w:pPr>
-      <w:bookmarkStart w:id="120" w:name="_Toc242387788"/>
+      <w:bookmarkStart w:id="120" w:name="_Toc242394404"/>
       <w:r>
         <w:t xml:space="preserve">Tabel 4. </w:t>
       </w:r>
@@ -38850,7 +38850,7 @@
       <w:pPr>
         <w:pStyle w:val="Keterangan"/>
       </w:pPr>
-      <w:bookmarkStart w:id="121" w:name="_Toc242387789"/>
+      <w:bookmarkStart w:id="121" w:name="_Toc242394405"/>
       <w:r>
         <w:t xml:space="preserve">Tabel 4. </w:t>
       </w:r>
@@ -39599,7 +39599,7 @@
                 <w:lang w:eastAsia="id-ID"/>
               </w:rPr>
             </w:pPr>
-            <w:bookmarkStart w:id="122" w:name="_Toc242387809"/>
+            <w:bookmarkStart w:id="122" w:name="_Toc242394425"/>
             <w:r>
               <w:t xml:space="preserve">Gambar 4. </w:t>
             </w:r>
@@ -39877,7 +39877,7 @@
       <w:pPr>
         <w:pStyle w:val="Judul2"/>
       </w:pPr>
-      <w:bookmarkStart w:id="123" w:name="_Toc242387756"/>
+      <w:bookmarkStart w:id="123" w:name="_Toc242394372"/>
       <w:r>
         <w:t>Prediksi</w:t>
       </w:r>
@@ -40101,7 +40101,7 @@
           <w:lang w:eastAsia="id-ID"/>
         </w:rPr>
       </w:pPr>
-      <w:bookmarkStart w:id="124" w:name="_Toc242387757"/>
+      <w:bookmarkStart w:id="124" w:name="_Toc242394373"/>
       <w:r>
         <w:rPr>
           <w:lang w:eastAsia="id-ID"/>
@@ -40130,7 +40130,7 @@
       <w:pPr>
         <w:pStyle w:val="Keterangan"/>
       </w:pPr>
-      <w:bookmarkStart w:id="125" w:name="_Toc242387790"/>
+      <w:bookmarkStart w:id="125" w:name="_Toc242394406"/>
       <w:r>
         <w:t xml:space="preserve">Tabel 4. </w:t>
       </w:r>
@@ -40943,7 +40943,7 @@
                 <w:lang w:eastAsia="id-ID"/>
               </w:rPr>
             </w:pPr>
-            <w:bookmarkStart w:id="126" w:name="_Toc242387810"/>
+            <w:bookmarkStart w:id="126" w:name="_Toc242394426"/>
             <w:r>
               <w:t xml:space="preserve">Gambar 4. </w:t>
             </w:r>
@@ -41016,7 +41016,7 @@
           <w:lang w:eastAsia="id-ID"/>
         </w:rPr>
       </w:pPr>
-      <w:bookmarkStart w:id="127" w:name="_Toc242387758"/>
+      <w:bookmarkStart w:id="127" w:name="_Toc242394374"/>
       <w:r>
         <w:rPr>
           <w:lang w:eastAsia="id-ID"/>
@@ -41048,7 +41048,7 @@
       <w:pPr>
         <w:pStyle w:val="Keterangan"/>
       </w:pPr>
-      <w:bookmarkStart w:id="128" w:name="_Toc242387791"/>
+      <w:bookmarkStart w:id="128" w:name="_Toc242394407"/>
       <w:r>
         <w:t xml:space="preserve">Tabel 4. </w:t>
       </w:r>
@@ -41639,7 +41639,7 @@
                 <w:lang w:eastAsia="id-ID"/>
               </w:rPr>
             </w:pPr>
-            <w:bookmarkStart w:id="129" w:name="_Toc242387811"/>
+            <w:bookmarkStart w:id="129" w:name="_Toc242394427"/>
             <w:r>
               <w:t xml:space="preserve">Gambar 4. </w:t>
             </w:r>
@@ -41703,7 +41703,7 @@
           <w:lang w:eastAsia="id-ID"/>
         </w:rPr>
       </w:pPr>
-      <w:bookmarkStart w:id="130" w:name="_Toc242387759"/>
+      <w:bookmarkStart w:id="130" w:name="_Toc242394375"/>
       <w:r>
         <w:rPr>
           <w:lang w:eastAsia="id-ID"/>
@@ -41735,7 +41735,7 @@
       <w:pPr>
         <w:pStyle w:val="Keterangan"/>
       </w:pPr>
-      <w:bookmarkStart w:id="131" w:name="_Toc242387792"/>
+      <w:bookmarkStart w:id="131" w:name="_Toc242394408"/>
       <w:r>
         <w:t xml:space="preserve">Tabel 4. </w:t>
       </w:r>
@@ -42718,7 +42718,7 @@
                 <w:lang w:eastAsia="id-ID"/>
               </w:rPr>
             </w:pPr>
-            <w:bookmarkStart w:id="132" w:name="_Toc242387812"/>
+            <w:bookmarkStart w:id="132" w:name="_Toc242394428"/>
             <w:r>
               <w:t xml:space="preserve">Gambar 4. </w:t>
             </w:r>
@@ -42842,7 +42842,7 @@
       <w:pPr>
         <w:pStyle w:val="Judul1"/>
       </w:pPr>
-      <w:bookmarkStart w:id="133" w:name="_Toc242387760"/>
+      <w:bookmarkStart w:id="133" w:name="_Toc242394376"/>
       <w:bookmarkEnd w:id="54"/>
       <w:r>
         <w:lastRenderedPageBreak/>
@@ -42876,7 +42876,7 @@
           <w:lang w:eastAsia="id-ID"/>
         </w:rPr>
       </w:pPr>
-      <w:bookmarkStart w:id="134" w:name="_Toc242387761"/>
+      <w:bookmarkStart w:id="134" w:name="_Toc242394377"/>
       <w:r>
         <w:rPr>
           <w:color w:val="EE0000"/>
@@ -42912,7 +42912,7 @@
           <w:lang w:eastAsia="id-ID"/>
         </w:rPr>
       </w:pPr>
-      <w:bookmarkStart w:id="135" w:name="_Toc242387762"/>
+      <w:bookmarkStart w:id="135" w:name="_Toc242394378"/>
       <w:r>
         <w:rPr>
           <w:lang w:eastAsia="id-ID"/>
@@ -42940,7 +42940,7 @@
       <w:pPr>
         <w:pStyle w:val="Keterangan"/>
       </w:pPr>
-      <w:bookmarkStart w:id="136" w:name="_Toc242387793"/>
+      <w:bookmarkStart w:id="136" w:name="_Toc242394409"/>
       <w:r>
         <w:t xml:space="preserve">Tabel 5. </w:t>
       </w:r>
@@ -43841,7 +43841,7 @@
                 <w:lang w:eastAsia="id-ID"/>
               </w:rPr>
             </w:pPr>
-            <w:bookmarkStart w:id="137" w:name="_Toc242387813"/>
+            <w:bookmarkStart w:id="137" w:name="_Toc242394429"/>
             <w:r>
               <w:t xml:space="preserve">Gambar 5. </w:t>
             </w:r>
@@ -43911,7 +43911,7 @@
       <w:pPr>
         <w:pStyle w:val="Judul3"/>
       </w:pPr>
-      <w:bookmarkStart w:id="138" w:name="_Toc242387763"/>
+      <w:bookmarkStart w:id="138" w:name="_Toc242394379"/>
       <w:r>
         <w:t>Identifikasi Masalah Menggunakan Analisis Isi (</w:t>
       </w:r>
@@ -44004,7 +44004,7 @@
       <w:pPr>
         <w:pStyle w:val="Keterangan"/>
       </w:pPr>
-      <w:bookmarkStart w:id="139" w:name="_Toc242387794"/>
+      <w:bookmarkStart w:id="139" w:name="_Toc242394410"/>
       <w:r>
         <w:t xml:space="preserve">Tabel 5. </w:t>
       </w:r>
@@ -45370,7 +45370,7 @@
       <w:pPr>
         <w:pStyle w:val="Keterangan"/>
       </w:pPr>
-      <w:bookmarkStart w:id="140" w:name="_Toc242387795"/>
+      <w:bookmarkStart w:id="140" w:name="_Toc242394411"/>
       <w:r>
         <w:t xml:space="preserve">Tabel 5. </w:t>
       </w:r>
@@ -46338,7 +46338,7 @@
       <w:pPr>
         <w:pStyle w:val="Keterangan"/>
       </w:pPr>
-      <w:bookmarkStart w:id="141" w:name="_Toc242387796"/>
+      <w:bookmarkStart w:id="141" w:name="_Toc242394412"/>
       <w:r>
         <w:t xml:space="preserve">Tabel 5. </w:t>
       </w:r>
@@ -47323,7 +47323,7 @@
       <w:pPr>
         <w:pStyle w:val="Keterangan"/>
       </w:pPr>
-      <w:bookmarkStart w:id="142" w:name="_Toc242387797"/>
+      <w:bookmarkStart w:id="142" w:name="_Toc242394413"/>
       <w:r>
         <w:t xml:space="preserve">Tabel 5. </w:t>
       </w:r>
@@ -48220,7 +48220,7 @@
         <w:pStyle w:val="Judul2"/>
       </w:pPr>
       <w:bookmarkStart w:id="143" w:name="_Toc9900007"/>
-      <w:bookmarkStart w:id="144" w:name="_Toc242387764"/>
+      <w:bookmarkStart w:id="144" w:name="_Toc242394380"/>
       <w:r>
         <w:rPr>
           <w:i/>
@@ -48303,7 +48303,7 @@
           <w:lang w:eastAsia="id-ID"/>
         </w:rPr>
       </w:pPr>
-      <w:bookmarkStart w:id="145" w:name="_Toc242387765"/>
+      <w:bookmarkStart w:id="145" w:name="_Toc242394381"/>
       <w:r>
         <w:rPr>
           <w:lang w:eastAsia="id-ID"/>
@@ -48318,7 +48318,7 @@
         <w:pStyle w:val="Keterangan"/>
         <w:jc w:val="both"/>
       </w:pPr>
-      <w:bookmarkStart w:id="146" w:name="_Toc242387798"/>
+      <w:bookmarkStart w:id="146" w:name="_Toc242394414"/>
       <w:r>
         <w:t xml:space="preserve">Tabel 5. </w:t>
       </w:r>
@@ -48933,7 +48933,7 @@
         <w:pStyle w:val="Keterangan"/>
         <w:jc w:val="both"/>
       </w:pPr>
-      <w:bookmarkStart w:id="147" w:name="_Toc242387799"/>
+      <w:bookmarkStart w:id="147" w:name="_Toc242394415"/>
       <w:r>
         <w:t xml:space="preserve">Tabel 5. </w:t>
       </w:r>
@@ -49533,7 +49533,7 @@
           <w:lang w:eastAsia="id-ID"/>
         </w:rPr>
       </w:pPr>
-      <w:bookmarkStart w:id="148" w:name="_Toc242387766"/>
+      <w:bookmarkStart w:id="148" w:name="_Toc242394382"/>
       <w:r>
         <w:rPr>
           <w:lang w:eastAsia="id-ID"/>
@@ -49547,7 +49547,7 @@
         <w:pStyle w:val="Keterangan"/>
         <w:jc w:val="both"/>
       </w:pPr>
-      <w:bookmarkStart w:id="149" w:name="_Toc242387800"/>
+      <w:bookmarkStart w:id="149" w:name="_Toc242394416"/>
       <w:r>
         <w:t xml:space="preserve">Tabel 5. </w:t>
       </w:r>
@@ -50189,7 +50189,7 @@
         <w:pStyle w:val="Keterangan"/>
         <w:jc w:val="both"/>
       </w:pPr>
-      <w:bookmarkStart w:id="150" w:name="_Toc242387801"/>
+      <w:bookmarkStart w:id="150" w:name="_Toc242394417"/>
       <w:r>
         <w:t xml:space="preserve">Tabel 5. </w:t>
       </w:r>
@@ -50863,7 +50863,7 @@
           <w:lang w:eastAsia="id-ID"/>
         </w:rPr>
       </w:pPr>
-      <w:bookmarkStart w:id="151" w:name="_Toc242387767"/>
+      <w:bookmarkStart w:id="151" w:name="_Toc242394383"/>
       <w:r>
         <w:rPr>
           <w:lang w:eastAsia="id-ID"/>
@@ -50877,7 +50877,7 @@
         <w:pStyle w:val="Keterangan"/>
         <w:jc w:val="both"/>
       </w:pPr>
-      <w:bookmarkStart w:id="152" w:name="_Toc242387802"/>
+      <w:bookmarkStart w:id="152" w:name="_Toc242394418"/>
       <w:r>
         <w:t xml:space="preserve">Tabel 5. </w:t>
       </w:r>
@@ -51471,7 +51471,7 @@
           <w:lang w:eastAsia="id-ID"/>
         </w:rPr>
       </w:pPr>
-      <w:bookmarkStart w:id="153" w:name="_Toc242387768"/>
+      <w:bookmarkStart w:id="153" w:name="_Toc242394384"/>
       <w:r>
         <w:rPr>
           <w:lang w:eastAsia="id-ID"/>
@@ -51485,7 +51485,7 @@
         <w:pStyle w:val="Keterangan"/>
         <w:jc w:val="both"/>
       </w:pPr>
-      <w:bookmarkStart w:id="154" w:name="_Toc242387803"/>
+      <w:bookmarkStart w:id="154" w:name="_Toc242394419"/>
       <w:r>
         <w:t xml:space="preserve">Tabel 5. </w:t>
       </w:r>
@@ -52081,7 +52081,7 @@
           <w:szCs w:val="27"/>
         </w:rPr>
       </w:pPr>
-      <w:bookmarkStart w:id="155" w:name="_Toc242387769"/>
+      <w:bookmarkStart w:id="155" w:name="_Toc242394385"/>
       <w:r>
         <w:rPr>
           <w:rStyle w:val="Kuat"/>
@@ -52217,7 +52217,7 @@
       <w:pPr>
         <w:pStyle w:val="Judul2"/>
       </w:pPr>
-      <w:bookmarkStart w:id="156" w:name="_Toc242387770"/>
+      <w:bookmarkStart w:id="156" w:name="_Toc242394386"/>
       <w:r>
         <w:t>Rekomendasi</w:t>
       </w:r>
@@ -52246,7 +52246,7 @@
       <w:pPr>
         <w:pStyle w:val="Keterangan"/>
       </w:pPr>
-      <w:bookmarkStart w:id="157" w:name="_Toc242387804"/>
+      <w:bookmarkStart w:id="157" w:name="_Toc242394420"/>
       <w:r>
         <w:t xml:space="preserve">Tabel 5. </w:t>
       </w:r>
@@ -52904,7 +52904,7 @@
           <w:lang w:eastAsia="id-ID"/>
         </w:rPr>
       </w:pPr>
-      <w:bookmarkStart w:id="158" w:name="_Toc242387771"/>
+      <w:bookmarkStart w:id="158" w:name="_Toc242394387"/>
       <w:r>
         <w:rPr>
           <w:lang w:eastAsia="id-ID"/>
@@ -52926,7 +52926,7 @@
           <w:lang w:eastAsia="id-ID"/>
         </w:rPr>
       </w:pPr>
-      <w:bookmarkStart w:id="159" w:name="_Toc242387772"/>
+      <w:bookmarkStart w:id="159" w:name="_Toc242394388"/>
       <w:r>
         <w:rPr>
           <w:lang w:eastAsia="id-ID"/>
@@ -53277,7 +53277,7 @@
           <w:lang w:eastAsia="id-ID"/>
         </w:rPr>
       </w:pPr>
-      <w:bookmarkStart w:id="160" w:name="_Toc242387773"/>
+      <w:bookmarkStart w:id="160" w:name="_Toc242394389"/>
       <w:r>
         <w:rPr>
           <w:lang w:eastAsia="id-ID"/>
@@ -53477,7 +53477,7 @@
         <w:pStyle w:val="ReferenceHeading"/>
       </w:pPr>
       <w:bookmarkStart w:id="161" w:name="_REF_97"/>
-      <w:bookmarkStart w:id="162" w:name="_Toc242387774"/>
+      <w:bookmarkStart w:id="162" w:name="_Toc242394390"/>
       <w:r>
         <w:lastRenderedPageBreak/>
         <w:t>DAFTAR REFERENSI</w:t>

</xml_diff>